<commit_message>
MAJ des procédures déjà existantes en améliorant la mise en page et en faisant une seconde vérification
</commit_message>
<xml_diff>
--- a/Documents/Procedure/Procedure_Annonce_Invalide_Taille_Image.docx
+++ b/Documents/Procedure/Procedure_Annonce_Invalide_Taille_Image.docx
@@ -1,175 +1,757 @@
 
 <file path=word/document.xml><?xml version="1.0" encoding="utf-8"?>
 <w:document xmlns:wpc="http://schemas.microsoft.com/office/word/2010/wordprocessingCanvas" xmlns:cx="http://schemas.microsoft.com/office/drawing/2014/chartex" xmlns:cx1="http://schemas.microsoft.com/office/drawing/2015/9/8/chartex" xmlns:cx2="http://schemas.microsoft.com/office/drawing/2015/10/21/chartex" xmlns:cx3="http://schemas.microsoft.com/office/drawing/2016/5/9/chartex" xmlns:cx4="http://schemas.microsoft.com/office/drawing/2016/5/10/chartex" xmlns:cx5="http://schemas.microsoft.com/office/drawing/2016/5/11/chartex" xmlns:cx6="http://schemas.microsoft.com/office/drawing/2016/5/12/chartex" xmlns:cx7="http://schemas.microsoft.com/office/drawing/2016/5/13/chartex" xmlns:cx8="http://schemas.microsoft.com/office/drawing/2016/5/14/chartex" xmlns:mc="http://schemas.openxmlformats.org/markup-compatibility/2006" xmlns:aink="http://schemas.microsoft.com/office/drawing/2016/ink" xmlns:am3d="http://schemas.microsoft.com/office/drawing/2017/model3d" xmlns:o="urn:schemas-microsoft-com:office:office" xmlns:oel="http://schemas.microsoft.com/office/2019/extlst" xmlns:r="http://schemas.openxmlformats.org/officeDocument/2006/relationships" xmlns:m="http://schemas.openxmlformats.org/officeDocument/2006/math" xmlns:v="urn:schemas-microsoft-com:vml" xmlns:wp14="http://schemas.microsoft.com/office/word/2010/wordprocessingDrawing" xmlns:wp="http://schemas.openxmlformats.org/drawingml/2006/wordprocessingDrawing" xmlns:w10="urn:schemas-microsoft-com:office:word" xmlns:w="http://schemas.openxmlformats.org/wordprocessingml/2006/main" xmlns:w14="http://schemas.microsoft.com/office/word/2010/wordml" xmlns:w15="http://schemas.microsoft.com/office/word/2012/wordml" xmlns:w16cex="http://schemas.microsoft.com/office/word/2018/wordml/cex" xmlns:w16cid="http://schemas.microsoft.com/office/word/2016/wordml/cid" xmlns:w16="http://schemas.microsoft.com/office/word/2018/wordml" xmlns:w16du="http://schemas.microsoft.com/office/word/2023/wordml/word16du" xmlns:w16sdtdh="http://schemas.microsoft.com/office/word/2020/wordml/sdtdatahash" xmlns:w16sdtfl="http://schemas.microsoft.com/office/word/2024/wordml/sdtformatlock" xmlns:w16se="http://schemas.microsoft.com/office/word/2015/wordml/symex" xmlns:wpg="http://schemas.microsoft.com/office/word/2010/wordprocessingGroup" xmlns:wpi="http://schemas.microsoft.com/office/word/2010/wordprocessingInk" xmlns:wne="http://schemas.microsoft.com/office/word/2006/wordml" xmlns:wps="http://schemas.microsoft.com/office/word/2010/wordprocessingShape" mc:Ignorable="w14 w15 w16se w16cid w16 w16cex w16sdtdh w16sdtfl w16du wp14">
+  <w:background w:color="F5F0E9"/>
   <w:body>
     <w:p>
       <w:pPr>
-        <w:pStyle w:val="Titre"/>
-        <w:jc w:val="center"/>
-      </w:pPr>
-      <w:r>
-        <w:t>PROCEDURE</w:t>
-      </w:r>
-      <w:r>
-        <w:t xml:space="preserve"> SUR LE PROBLEME D’ENVOI DES IMAGES</w:t>
+        <w:jc w:val="both"/>
+        <w:rPr>
+          <w:rFonts w:ascii="Poppins" w:hAnsi="Poppins" w:cs="Poppins"/>
+          <w:b/>
+          <w:bCs/>
+          <w:sz w:val="44"/>
+          <w:szCs w:val="44"/>
+        </w:rPr>
+      </w:pPr>
+      <w:r>
+        <w:rPr>
+          <w:rFonts w:ascii="Poppins" w:hAnsi="Poppins" w:cs="Poppins"/>
+          <w:b/>
+          <w:bCs/>
+          <w:sz w:val="44"/>
+          <w:szCs w:val="44"/>
+        </w:rPr>
+        <w:drawing>
+          <wp:anchor distT="0" distB="0" distL="114300" distR="114300" simplePos="0" relativeHeight="251658240" behindDoc="0" locked="0" layoutInCell="1" allowOverlap="1" wp14:anchorId="47D5BF0A" wp14:editId="0901F5E9">
+            <wp:simplePos x="0" y="0"/>
+            <wp:positionH relativeFrom="column">
+              <wp:posOffset>119380</wp:posOffset>
+            </wp:positionH>
+            <wp:positionV relativeFrom="paragraph">
+              <wp:posOffset>0</wp:posOffset>
+            </wp:positionV>
+            <wp:extent cx="1019175" cy="1019175"/>
+            <wp:effectExtent l="0" t="0" r="9525" b="0"/>
+            <wp:wrapSquare wrapText="bothSides"/>
+            <wp:docPr id="2004749597" name="Image 1" descr="Une image contenant dessin, outil, conception&#10;&#10;Le contenu généré par l’IA peut être incorrect."/>
+            <wp:cNvGraphicFramePr>
+              <a:graphicFrameLocks xmlns:a="http://schemas.openxmlformats.org/drawingml/2006/main" noChangeAspect="1"/>
+            </wp:cNvGraphicFramePr>
+            <a:graphic xmlns:a="http://schemas.openxmlformats.org/drawingml/2006/main">
+              <a:graphicData uri="http://schemas.openxmlformats.org/drawingml/2006/picture">
+                <pic:pic xmlns:pic="http://schemas.openxmlformats.org/drawingml/2006/picture">
+                  <pic:nvPicPr>
+                    <pic:cNvPr id="2004749597" name="Image 1" descr="Une image contenant dessin, outil, conception&#10;&#10;Le contenu généré par l’IA peut être incorrect."/>
+                    <pic:cNvPicPr>
+                      <a:picLocks noChangeAspect="1" noChangeArrowheads="1"/>
+                    </pic:cNvPicPr>
+                  </pic:nvPicPr>
+                  <pic:blipFill>
+                    <a:blip r:embed="rId8" cstate="print">
+                      <a:extLst>
+                        <a:ext uri="{28A0092B-C50C-407E-A947-70E740481C1C}">
+                          <a14:useLocalDpi xmlns:a14="http://schemas.microsoft.com/office/drawing/2010/main" val="0"/>
+                        </a:ext>
+                      </a:extLst>
+                    </a:blip>
+                    <a:srcRect/>
+                    <a:stretch>
+                      <a:fillRect/>
+                    </a:stretch>
+                  </pic:blipFill>
+                  <pic:spPr bwMode="auto">
+                    <a:xfrm>
+                      <a:off x="0" y="0"/>
+                      <a:ext cx="1019175" cy="1019175"/>
+                    </a:xfrm>
+                    <a:prstGeom prst="rect">
+                      <a:avLst/>
+                    </a:prstGeom>
+                    <a:noFill/>
+                    <a:ln>
+                      <a:noFill/>
+                    </a:ln>
+                  </pic:spPr>
+                </pic:pic>
+              </a:graphicData>
+            </a:graphic>
+          </wp:anchor>
+        </w:drawing>
+      </w:r>
+      <w:r>
+        <w:rPr>
+          <w:rFonts w:ascii="Poppins" w:hAnsi="Poppins" w:cs="Poppins"/>
+          <w:b/>
+          <w:bCs/>
+          <w:sz w:val="44"/>
+          <w:szCs w:val="44"/>
+        </w:rPr>
+        <w:t>PROC</w:t>
+      </w:r>
+      <w:r>
+        <w:rPr>
+          <w:rFonts w:ascii="Poppins" w:hAnsi="Poppins" w:cs="Poppins"/>
+          <w:b/>
+          <w:bCs/>
+          <w:sz w:val="44"/>
+          <w:szCs w:val="44"/>
+        </w:rPr>
+        <w:t>É</w:t>
+      </w:r>
+      <w:r>
+        <w:rPr>
+          <w:rFonts w:ascii="Poppins" w:hAnsi="Poppins" w:cs="Poppins"/>
+          <w:b/>
+          <w:bCs/>
+          <w:sz w:val="44"/>
+          <w:szCs w:val="44"/>
+        </w:rPr>
+        <w:t>DURE</w:t>
+      </w:r>
+      <w:r>
+        <w:rPr>
+          <w:rFonts w:ascii="Poppins" w:hAnsi="Poppins" w:cs="Poppins"/>
+          <w:b/>
+          <w:bCs/>
+          <w:sz w:val="44"/>
+          <w:szCs w:val="44"/>
+        </w:rPr>
+        <w:t xml:space="preserve"> SUR LE PROBL</w:t>
+      </w:r>
+      <w:r>
+        <w:rPr>
+          <w:rFonts w:ascii="Poppins" w:hAnsi="Poppins" w:cs="Poppins"/>
+          <w:b/>
+          <w:bCs/>
+          <w:sz w:val="44"/>
+          <w:szCs w:val="44"/>
+        </w:rPr>
+        <w:t>È</w:t>
+      </w:r>
+      <w:r>
+        <w:rPr>
+          <w:rFonts w:ascii="Poppins" w:hAnsi="Poppins" w:cs="Poppins"/>
+          <w:b/>
+          <w:bCs/>
+          <w:sz w:val="44"/>
+          <w:szCs w:val="44"/>
+        </w:rPr>
+        <w:t>ME D’ENVOI DES IMAGES</w:t>
       </w:r>
     </w:p>
     <w:p>
       <w:pPr>
-        <w:jc w:val="center"/>
+        <w:jc w:val="both"/>
+        <w:rPr>
+          <w:rFonts w:ascii="Poppins" w:hAnsi="Poppins" w:cs="Poppins"/>
+        </w:rPr>
       </w:pPr>
     </w:p>
     <w:p>
-      <w:r>
+      <w:pPr>
+        <w:jc w:val="both"/>
+        <w:rPr>
+          <w:rFonts w:ascii="Poppins" w:hAnsi="Poppins" w:cs="Poppins"/>
+        </w:rPr>
+      </w:pPr>
+    </w:p>
+    <w:sdt>
+      <w:sdtPr>
+        <w:rPr>
+          <w:rFonts w:ascii="Poppins" w:hAnsi="Poppins" w:cs="Poppins"/>
+        </w:rPr>
+        <w:id w:val="-811020469"/>
+        <w:docPartObj>
+          <w:docPartGallery w:val="Table of Contents"/>
+          <w:docPartUnique/>
+        </w:docPartObj>
+      </w:sdtPr>
+      <w:sdtEndPr>
+        <w:rPr>
+          <w:rFonts w:eastAsiaTheme="minorHAnsi"/>
+          <w:b/>
+          <w:bCs/>
+          <w:color w:val="112250"/>
+          <w:kern w:val="2"/>
+          <w:sz w:val="24"/>
+          <w:szCs w:val="24"/>
+          <w:lang w:eastAsia="en-US"/>
+          <w14:ligatures w14:val="standardContextual"/>
+        </w:rPr>
+      </w:sdtEndPr>
+      <w:sdtContent>
+        <w:p>
+          <w:pPr>
+            <w:pStyle w:val="En-ttedetabledesmatires"/>
+            <w:jc w:val="both"/>
+            <w:rPr>
+              <w:rFonts w:ascii="Poppins" w:hAnsi="Poppins" w:cs="Poppins"/>
+              <w:b/>
+              <w:bCs/>
+              <w:color w:val="112250"/>
+            </w:rPr>
+          </w:pPr>
+          <w:r>
+            <w:rPr>
+              <w:rFonts w:ascii="Poppins" w:hAnsi="Poppins" w:cs="Poppins"/>
+              <w:b/>
+              <w:bCs/>
+              <w:color w:val="112250"/>
+            </w:rPr>
+            <w:t>Table des matières</w:t>
+          </w:r>
+        </w:p>
+        <w:p>
+          <w:pPr>
+            <w:pStyle w:val="TM2"/>
+            <w:tabs>
+              <w:tab w:val="right" w:leader="dot" w:pos="9062"/>
+            </w:tabs>
+            <w:rPr>
+              <w:rFonts w:eastAsiaTheme="minorEastAsia"/>
+              <w:noProof/>
+              <w:color w:val="auto"/>
+              <w:lang w:eastAsia="fr-FR"/>
+            </w:rPr>
+          </w:pPr>
+          <w:r>
+            <w:rPr>
+              <w:rFonts w:ascii="Poppins" w:hAnsi="Poppins" w:cs="Poppins"/>
+            </w:rPr>
+            <w:fldChar w:fldCharType="begin"/>
+          </w:r>
+          <w:r>
+            <w:rPr>
+              <w:rFonts w:ascii="Poppins" w:hAnsi="Poppins" w:cs="Poppins"/>
+            </w:rPr>
+            <w:instrText xml:space="preserve"> TOC \o "1-3" \h \z \u </w:instrText>
+          </w:r>
+          <w:r>
+            <w:rPr>
+              <w:rFonts w:ascii="Poppins" w:hAnsi="Poppins" w:cs="Poppins"/>
+            </w:rPr>
+            <w:fldChar w:fldCharType="separate"/>
+          </w:r>
+          <w:hyperlink w:anchor="_Toc222669573" w:history="1">
+            <w:r>
+              <w:rPr>
+                <w:rStyle w:val="Lienhypertexte"/>
+                <w:rFonts w:ascii="Poppins" w:hAnsi="Poppins" w:cs="Poppins"/>
+                <w:noProof/>
+              </w:rPr>
+              <w:t>Introduction</w:t>
+            </w:r>
+            <w:r>
+              <w:rPr>
+                <w:noProof/>
+                <w:webHidden/>
+              </w:rPr>
+              <w:tab/>
+            </w:r>
+            <w:r>
+              <w:rPr>
+                <w:noProof/>
+                <w:webHidden/>
+              </w:rPr>
+              <w:fldChar w:fldCharType="begin"/>
+            </w:r>
+            <w:r>
+              <w:rPr>
+                <w:noProof/>
+                <w:webHidden/>
+              </w:rPr>
+              <w:instrText xml:space="preserve"> PAGEREF _Toc222669573 \h </w:instrText>
+            </w:r>
+            <w:r>
+              <w:rPr>
+                <w:noProof/>
+                <w:webHidden/>
+              </w:rPr>
+            </w:r>
+            <w:r>
+              <w:rPr>
+                <w:noProof/>
+                <w:webHidden/>
+              </w:rPr>
+              <w:fldChar w:fldCharType="separate"/>
+            </w:r>
+            <w:r>
+              <w:rPr>
+                <w:noProof/>
+                <w:webHidden/>
+              </w:rPr>
+              <w:t>1</w:t>
+            </w:r>
+            <w:r>
+              <w:rPr>
+                <w:noProof/>
+                <w:webHidden/>
+              </w:rPr>
+              <w:fldChar w:fldCharType="end"/>
+            </w:r>
+          </w:hyperlink>
+        </w:p>
+        <w:p>
+          <w:pPr>
+            <w:pStyle w:val="TM2"/>
+            <w:tabs>
+              <w:tab w:val="right" w:leader="dot" w:pos="9062"/>
+            </w:tabs>
+            <w:rPr>
+              <w:rFonts w:eastAsiaTheme="minorEastAsia"/>
+              <w:noProof/>
+              <w:color w:val="auto"/>
+              <w:lang w:eastAsia="fr-FR"/>
+            </w:rPr>
+          </w:pPr>
+          <w:hyperlink w:anchor="_Toc222669574" w:history="1">
+            <w:r>
+              <w:rPr>
+                <w:rStyle w:val="Lienhypertexte"/>
+                <w:rFonts w:ascii="Poppins" w:hAnsi="Poppins" w:cs="Poppins"/>
+                <w:noProof/>
+              </w:rPr>
+              <w:t>Comment résoudre le problème</w:t>
+            </w:r>
+            <w:r>
+              <w:rPr>
+                <w:noProof/>
+                <w:webHidden/>
+              </w:rPr>
+              <w:tab/>
+            </w:r>
+            <w:r>
+              <w:rPr>
+                <w:noProof/>
+                <w:webHidden/>
+              </w:rPr>
+              <w:fldChar w:fldCharType="begin"/>
+            </w:r>
+            <w:r>
+              <w:rPr>
+                <w:noProof/>
+                <w:webHidden/>
+              </w:rPr>
+              <w:instrText xml:space="preserve"> PAGEREF _Toc222669574 \h </w:instrText>
+            </w:r>
+            <w:r>
+              <w:rPr>
+                <w:noProof/>
+                <w:webHidden/>
+              </w:rPr>
+            </w:r>
+            <w:r>
+              <w:rPr>
+                <w:noProof/>
+                <w:webHidden/>
+              </w:rPr>
+              <w:fldChar w:fldCharType="separate"/>
+            </w:r>
+            <w:r>
+              <w:rPr>
+                <w:noProof/>
+                <w:webHidden/>
+              </w:rPr>
+              <w:t>2</w:t>
+            </w:r>
+            <w:r>
+              <w:rPr>
+                <w:noProof/>
+                <w:webHidden/>
+              </w:rPr>
+              <w:fldChar w:fldCharType="end"/>
+            </w:r>
+          </w:hyperlink>
+        </w:p>
+        <w:p>
+          <w:pPr>
+            <w:jc w:val="both"/>
+            <w:rPr>
+              <w:rFonts w:ascii="Poppins" w:hAnsi="Poppins" w:cs="Poppins"/>
+              <w:b/>
+              <w:bCs/>
+            </w:rPr>
+          </w:pPr>
+          <w:r>
+            <w:rPr>
+              <w:rFonts w:ascii="Poppins" w:hAnsi="Poppins" w:cs="Poppins"/>
+              <w:b/>
+              <w:bCs/>
+            </w:rPr>
+            <w:fldChar w:fldCharType="end"/>
+          </w:r>
+        </w:p>
+        <w:p>
+          <w:pPr>
+            <w:jc w:val="both"/>
+            <w:rPr>
+              <w:rFonts w:ascii="Poppins" w:hAnsi="Poppins" w:cs="Poppins"/>
+            </w:rPr>
+          </w:pPr>
+        </w:p>
+      </w:sdtContent>
+    </w:sdt>
+    <w:p>
+      <w:pPr>
+        <w:pStyle w:val="Titre2"/>
+        <w:jc w:val="both"/>
+        <w:rPr>
+          <w:rFonts w:ascii="Poppins" w:hAnsi="Poppins" w:cs="Poppins"/>
+        </w:rPr>
+      </w:pPr>
+      <w:bookmarkStart w:id="0" w:name="_Toc222669573"/>
+      <w:r>
+        <w:rPr>
+          <w:rFonts w:ascii="Poppins" w:hAnsi="Poppins" w:cs="Poppins"/>
+        </w:rPr>
+        <w:t>Introduction</w:t>
+      </w:r>
+      <w:bookmarkEnd w:id="0"/>
+    </w:p>
+    <w:p>
+      <w:pPr>
+        <w:jc w:val="both"/>
+        <w:rPr>
+          <w:rFonts w:ascii="Poppins" w:hAnsi="Poppins" w:cs="Poppins"/>
+        </w:rPr>
+      </w:pPr>
+    </w:p>
+    <w:p>
+      <w:pPr>
+        <w:jc w:val="both"/>
+        <w:rPr>
+          <w:rFonts w:ascii="Poppins" w:hAnsi="Poppins" w:cs="Poppins"/>
+        </w:rPr>
+      </w:pPr>
+      <w:r>
+        <w:rPr>
+          <w:rFonts w:ascii="Poppins" w:hAnsi="Poppins" w:cs="Poppins"/>
+        </w:rPr>
         <w:t>Cette procédure vise à permettre la correction d’une erreur externe au code</w:t>
       </w:r>
       <w:r>
-        <w:t xml:space="preserve"> concernant l’envoi du formulaire lors de la publication d’une nouvelle annonce d’enchère</w:t>
-      </w:r>
-      <w:r>
+        <w:rPr>
+          <w:rFonts w:ascii="Poppins" w:hAnsi="Poppins" w:cs="Poppins"/>
+        </w:rPr>
+        <w:t xml:space="preserve"> concernant l’envoi du formulaire</w:t>
+      </w:r>
+      <w:r>
+        <w:rPr>
+          <w:rFonts w:ascii="Poppins" w:hAnsi="Poppins" w:cs="Poppins"/>
+        </w:rPr>
+        <w:t>,</w:t>
+      </w:r>
+      <w:r>
+        <w:rPr>
+          <w:rFonts w:ascii="Poppins" w:hAnsi="Poppins" w:cs="Poppins"/>
+        </w:rPr>
+        <w:t xml:space="preserve"> lors de la publication d’une nouvelle annonce</w:t>
+      </w:r>
+      <w:r>
+        <w:rPr>
+          <w:rFonts w:ascii="Poppins" w:hAnsi="Poppins" w:cs="Poppins"/>
+        </w:rPr>
+        <w:t xml:space="preserve"> </w:t>
+      </w:r>
+      <w:r>
+        <w:rPr>
+          <w:rFonts w:ascii="Poppins" w:hAnsi="Poppins" w:cs="Poppins"/>
+        </w:rPr>
+        <w:t>d’enchère</w:t>
+      </w:r>
+      <w:r>
+        <w:rPr>
+          <w:rFonts w:ascii="Poppins" w:hAnsi="Poppins" w:cs="Poppins"/>
+        </w:rPr>
         <w:t xml:space="preserve">. </w:t>
       </w:r>
       <w:r>
+        <w:rPr>
+          <w:rFonts w:ascii="Poppins" w:hAnsi="Poppins" w:cs="Poppins"/>
+        </w:rPr>
         <w:br/>
         <w:t>Ce problème</w:t>
       </w:r>
       <w:r>
+        <w:rPr>
+          <w:rFonts w:ascii="Poppins" w:hAnsi="Poppins" w:cs="Poppins"/>
+        </w:rPr>
         <w:t xml:space="preserve"> e</w:t>
       </w:r>
       <w:r>
+        <w:rPr>
+          <w:rFonts w:ascii="Poppins" w:hAnsi="Poppins" w:cs="Poppins"/>
+        </w:rPr>
         <w:t>s</w:t>
       </w:r>
       <w:r>
+        <w:rPr>
+          <w:rFonts w:ascii="Poppins" w:hAnsi="Poppins" w:cs="Poppins"/>
+        </w:rPr>
         <w:t>t</w:t>
       </w:r>
       <w:r>
+        <w:rPr>
+          <w:rFonts w:ascii="Poppins" w:hAnsi="Poppins" w:cs="Poppins"/>
+        </w:rPr>
         <w:t xml:space="preserve"> en</w:t>
       </w:r>
       <w:r>
+        <w:rPr>
+          <w:rFonts w:ascii="Poppins" w:hAnsi="Poppins" w:cs="Poppins"/>
+        </w:rPr>
         <w:t xml:space="preserve"> lien avec l’environnement local </w:t>
       </w:r>
       <w:r>
+        <w:rPr>
+          <w:rFonts w:ascii="Poppins" w:hAnsi="Poppins" w:cs="Poppins"/>
+        </w:rPr>
         <w:t>de</w:t>
       </w:r>
       <w:r>
+        <w:rPr>
+          <w:rFonts w:ascii="Poppins" w:hAnsi="Poppins" w:cs="Poppins"/>
+        </w:rPr>
         <w:t xml:space="preserve"> </w:t>
       </w:r>
       <w:r>
+        <w:rPr>
+          <w:rFonts w:ascii="Poppins" w:hAnsi="Poppins" w:cs="Poppins"/>
+        </w:rPr>
         <w:t>WampServer</w:t>
       </w:r>
       <w:r>
+        <w:rPr>
+          <w:rFonts w:ascii="Poppins" w:hAnsi="Poppins" w:cs="Poppins"/>
+        </w:rPr>
         <w:t>. N</w:t>
       </w:r>
       <w:r>
+        <w:rPr>
+          <w:rFonts w:ascii="Poppins" w:hAnsi="Poppins" w:cs="Poppins"/>
+        </w:rPr>
         <w:t xml:space="preserve">ous avons rencontré ce problème </w:t>
       </w:r>
       <w:r>
+        <w:rPr>
+          <w:rFonts w:ascii="Poppins" w:hAnsi="Poppins" w:cs="Poppins"/>
+        </w:rPr>
         <w:t xml:space="preserve">lors nos tests, </w:t>
       </w:r>
       <w:r>
+        <w:rPr>
+          <w:rFonts w:ascii="Poppins" w:hAnsi="Poppins" w:cs="Poppins"/>
+        </w:rPr>
         <w:t>ce pourquoi nous rédigeons cette procédure</w:t>
       </w:r>
       <w:r>
+        <w:rPr>
+          <w:rFonts w:ascii="Poppins" w:hAnsi="Poppins" w:cs="Poppins"/>
+        </w:rPr>
         <w:t>.</w:t>
       </w:r>
     </w:p>
     <w:p>
-      <w:r>
+      <w:pPr>
+        <w:jc w:val="both"/>
+        <w:rPr>
+          <w:rFonts w:ascii="Poppins" w:hAnsi="Poppins" w:cs="Poppins"/>
+        </w:rPr>
+      </w:pPr>
+      <w:r>
+        <w:rPr>
+          <w:rFonts w:ascii="Poppins" w:hAnsi="Poppins" w:cs="Poppins"/>
+        </w:rPr>
         <w:br/>
       </w:r>
       <w:r>
+        <w:rPr>
+          <w:rFonts w:ascii="Poppins" w:hAnsi="Poppins" w:cs="Poppins"/>
+        </w:rPr>
         <w:t>Cette erreur indique que le formulaire est invalide</w:t>
       </w:r>
       <w:r>
+        <w:rPr>
+          <w:rFonts w:ascii="Poppins" w:hAnsi="Poppins" w:cs="Poppins"/>
+        </w:rPr>
         <w:t xml:space="preserve"> et vide</w:t>
       </w:r>
       <w:r>
+        <w:rPr>
+          <w:rFonts w:ascii="Poppins" w:hAnsi="Poppins" w:cs="Poppins"/>
+        </w:rPr>
         <w:t>.</w:t>
       </w:r>
       <w:r>
+        <w:rPr>
+          <w:rFonts w:ascii="Poppins" w:hAnsi="Poppins" w:cs="Poppins"/>
+        </w:rPr>
         <w:t xml:space="preserve"> Cela est </w:t>
       </w:r>
       <w:r>
+        <w:rPr>
+          <w:rFonts w:ascii="Poppins" w:hAnsi="Poppins" w:cs="Poppins"/>
+        </w:rPr>
         <w:t>dû</w:t>
       </w:r>
       <w:r>
+        <w:rPr>
+          <w:rFonts w:ascii="Poppins" w:hAnsi="Poppins" w:cs="Poppins"/>
+        </w:rPr>
         <w:t xml:space="preserve"> </w:t>
       </w:r>
       <w:r>
+        <w:rPr>
+          <w:rFonts w:ascii="Poppins" w:hAnsi="Poppins" w:cs="Poppins"/>
+        </w:rPr>
         <w:t>à</w:t>
       </w:r>
       <w:r>
+        <w:rPr>
+          <w:rFonts w:ascii="Poppins" w:hAnsi="Poppins" w:cs="Poppins"/>
+        </w:rPr>
         <w:t xml:space="preserve"> </w:t>
       </w:r>
       <w:r>
+        <w:rPr>
+          <w:rFonts w:ascii="Poppins" w:hAnsi="Poppins" w:cs="Poppins"/>
+        </w:rPr>
         <w:t>une insertion</w:t>
       </w:r>
       <w:r>
+        <w:rPr>
+          <w:rFonts w:ascii="Poppins" w:hAnsi="Poppins" w:cs="Poppins"/>
+        </w:rPr>
         <w:t xml:space="preserve"> d’image</w:t>
       </w:r>
       <w:r>
+        <w:rPr>
+          <w:rFonts w:ascii="Poppins" w:hAnsi="Poppins" w:cs="Poppins"/>
+        </w:rPr>
         <w:t>s</w:t>
       </w:r>
       <w:r>
+        <w:rPr>
+          <w:rFonts w:ascii="Poppins" w:hAnsi="Poppins" w:cs="Poppins"/>
+        </w:rPr>
         <w:t xml:space="preserve"> de </w:t>
       </w:r>
       <w:r>
+        <w:rPr>
+          <w:rFonts w:ascii="Poppins" w:hAnsi="Poppins" w:cs="Poppins"/>
+        </w:rPr>
         <w:t>taille</w:t>
       </w:r>
       <w:r>
+        <w:rPr>
+          <w:rFonts w:ascii="Poppins" w:hAnsi="Poppins" w:cs="Poppins"/>
+        </w:rPr>
         <w:t xml:space="preserve"> trop volumineuse</w:t>
       </w:r>
       <w:r>
+        <w:rPr>
+          <w:rFonts w:ascii="Poppins" w:hAnsi="Poppins" w:cs="Poppins"/>
+        </w:rPr>
         <w:t>s</w:t>
       </w:r>
       <w:r>
+        <w:rPr>
+          <w:rFonts w:ascii="Poppins" w:hAnsi="Poppins" w:cs="Poppins"/>
+        </w:rPr>
         <w:t xml:space="preserve"> et</w:t>
       </w:r>
       <w:r>
+        <w:rPr>
+          <w:rFonts w:ascii="Poppins" w:hAnsi="Poppins" w:cs="Poppins"/>
+        </w:rPr>
         <w:t xml:space="preserve"> au fait qu’une limite</w:t>
       </w:r>
       <w:r>
+        <w:rPr>
+          <w:rFonts w:ascii="Poppins" w:hAnsi="Poppins" w:cs="Poppins"/>
+        </w:rPr>
         <w:t xml:space="preserve"> e</w:t>
       </w:r>
       <w:r>
+        <w:rPr>
+          <w:rFonts w:ascii="Poppins" w:hAnsi="Poppins" w:cs="Poppins"/>
+        </w:rPr>
         <w:t>s</w:t>
       </w:r>
       <w:r>
+        <w:rPr>
+          <w:rFonts w:ascii="Poppins" w:hAnsi="Poppins" w:cs="Poppins"/>
+        </w:rPr>
         <w:t>t défini</w:t>
       </w:r>
       <w:r>
+        <w:rPr>
+          <w:rFonts w:ascii="Poppins" w:hAnsi="Poppins" w:cs="Poppins"/>
+        </w:rPr>
         <w:t>e</w:t>
       </w:r>
       <w:r>
+        <w:rPr>
+          <w:rFonts w:ascii="Poppins" w:hAnsi="Poppins" w:cs="Poppins"/>
+        </w:rPr>
         <w:t xml:space="preserve"> </w:t>
       </w:r>
       <w:r>
+        <w:rPr>
+          <w:rFonts w:ascii="Poppins" w:hAnsi="Poppins" w:cs="Poppins"/>
+        </w:rPr>
         <w:t xml:space="preserve">dans les paramètres de </w:t>
       </w:r>
       <w:r>
+        <w:rPr>
+          <w:rFonts w:ascii="Poppins" w:hAnsi="Poppins" w:cs="Poppins"/>
+        </w:rPr>
         <w:t>WampServer</w:t>
       </w:r>
       <w:r>
+        <w:rPr>
+          <w:rFonts w:ascii="Poppins" w:hAnsi="Poppins" w:cs="Poppins"/>
+        </w:rPr>
         <w:t xml:space="preserve"> dans le fichier php.ini.</w:t>
       </w:r>
     </w:p>
     <w:p>
-      <w:r>
+      <w:pPr>
+        <w:jc w:val="both"/>
+        <w:rPr>
+          <w:rFonts w:ascii="Poppins" w:hAnsi="Poppins" w:cs="Poppins"/>
+        </w:rPr>
+      </w:pPr>
+      <w:r>
+        <w:rPr>
+          <w:rFonts w:ascii="Poppins" w:hAnsi="Poppins" w:cs="Poppins"/>
+        </w:rPr>
         <w:t xml:space="preserve">Erreur </w:t>
       </w:r>
       <w:r>
+        <w:rPr>
+          <w:rFonts w:ascii="Poppins" w:hAnsi="Poppins" w:cs="Poppins"/>
+        </w:rPr>
         <w:t>retournée possible</w:t>
       </w:r>
       <w:r>
+        <w:rPr>
+          <w:rFonts w:ascii="Poppins" w:hAnsi="Poppins" w:cs="Poppins"/>
+        </w:rPr>
         <w:t xml:space="preserve"> : </w:t>
       </w:r>
     </w:p>
     <w:p>
       <w:pPr>
-        <w:jc w:val="center"/>
-      </w:pPr>
-      <w:r>
-        <w:rPr>
+        <w:jc w:val="both"/>
+        <w:rPr>
+          <w:rFonts w:ascii="Poppins" w:hAnsi="Poppins" w:cs="Poppins"/>
+        </w:rPr>
+      </w:pPr>
+      <w:r>
+        <w:rPr>
+          <w:rFonts w:ascii="Poppins" w:hAnsi="Poppins" w:cs="Poppins"/>
           <w:noProof/>
         </w:rPr>
         <w:drawing>
@@ -188,7 +770,7 @@
                     <pic:cNvPicPr/>
                   </pic:nvPicPr>
                   <pic:blipFill>
-                    <a:blip r:embed="rId5"/>
+                    <a:blip r:embed="rId9"/>
                     <a:stretch>
                       <a:fillRect/>
                     </a:stretch>
@@ -209,80 +791,321 @@
         </w:drawing>
       </w:r>
     </w:p>
-    <w:p/>
     <w:p>
-      <w:r>
-        <w:t>Dans votre environnement</w:t>
-      </w:r>
-      <w:r>
-        <w:t>,</w:t>
-      </w:r>
-      <w:r>
-        <w:t xml:space="preserve"> </w:t>
-      </w:r>
-      <w:r>
-        <w:rPr>
-          <w:b/>
-          <w:bCs/>
-        </w:rPr>
-        <w:t>recherche</w:t>
-      </w:r>
-      <w:r>
-        <w:rPr>
-          <w:b/>
-          <w:bCs/>
-        </w:rPr>
-        <w:t>z</w:t>
-      </w:r>
-      <w:r>
-        <w:rPr>
-          <w:b/>
-          <w:bCs/>
-        </w:rPr>
-        <w:t xml:space="preserve"> le fichier php.ini</w:t>
-      </w:r>
-      <w:r>
-        <w:t xml:space="preserve"> et </w:t>
-      </w:r>
-      <w:r>
-        <w:rPr>
-          <w:b/>
-          <w:bCs/>
-        </w:rPr>
-        <w:t>effectu</w:t>
-      </w:r>
-      <w:r>
-        <w:rPr>
-          <w:b/>
-          <w:bCs/>
-        </w:rPr>
-        <w:t>ez</w:t>
-      </w:r>
-      <w:r>
-        <w:rPr>
-          <w:b/>
-          <w:bCs/>
-        </w:rPr>
-        <w:t xml:space="preserve"> ces modifications :</w:t>
+      <w:pPr>
+        <w:rPr>
+          <w:rFonts w:ascii="Poppins" w:hAnsi="Poppins" w:cs="Poppins"/>
+        </w:rPr>
+      </w:pPr>
+      <w:r>
+        <w:rPr>
+          <w:rFonts w:ascii="Poppins" w:hAnsi="Poppins" w:cs="Poppins"/>
+        </w:rPr>
+        <w:br w:type="page"/>
       </w:r>
     </w:p>
     <w:p>
-      <w:r>
-        <w:rPr>
+      <w:pPr>
+        <w:jc w:val="both"/>
+        <w:rPr>
+          <w:rFonts w:ascii="Poppins" w:hAnsi="Poppins" w:cs="Poppins"/>
+        </w:rPr>
+      </w:pPr>
+    </w:p>
+    <w:p>
+      <w:pPr>
+        <w:pStyle w:val="Titre2"/>
+        <w:jc w:val="both"/>
+        <w:rPr>
+          <w:rFonts w:ascii="Poppins" w:hAnsi="Poppins" w:cs="Poppins"/>
+        </w:rPr>
+      </w:pPr>
+      <w:bookmarkStart w:id="1" w:name="_Toc222669574"/>
+      <w:r>
+        <w:rPr>
+          <w:rFonts w:ascii="Poppins" w:hAnsi="Poppins" w:cs="Poppins"/>
+        </w:rPr>
+        <w:t>Comment résoudre le problème</w:t>
+      </w:r>
+      <w:bookmarkEnd w:id="1"/>
+    </w:p>
+    <w:p>
+      <w:pPr>
+        <w:jc w:val="both"/>
+        <w:rPr>
+          <w:rFonts w:ascii="Poppins" w:hAnsi="Poppins" w:cs="Poppins"/>
+        </w:rPr>
+      </w:pPr>
+    </w:p>
+    <w:p>
+      <w:pPr>
+        <w:jc w:val="both"/>
+        <w:rPr>
+          <w:rFonts w:ascii="Poppins" w:hAnsi="Poppins" w:cs="Poppins"/>
+        </w:rPr>
+      </w:pPr>
+      <w:r>
+        <w:rPr>
+          <w:rFonts w:ascii="Poppins" w:hAnsi="Poppins" w:cs="Poppins"/>
+        </w:rPr>
+        <w:t>Dans votre environnement</w:t>
+      </w:r>
+      <w:r>
+        <w:rPr>
+          <w:rFonts w:ascii="Poppins" w:hAnsi="Poppins" w:cs="Poppins"/>
+        </w:rPr>
+        <w:t>,</w:t>
+      </w:r>
+      <w:r>
+        <w:rPr>
+          <w:rFonts w:ascii="Poppins" w:hAnsi="Poppins" w:cs="Poppins"/>
+        </w:rPr>
+        <w:t xml:space="preserve"> </w:t>
+      </w:r>
+      <w:r>
+        <w:rPr>
+          <w:rFonts w:ascii="Poppins" w:hAnsi="Poppins" w:cs="Poppins"/>
+          <w:b/>
+          <w:bCs/>
+        </w:rPr>
+        <w:t>recherche</w:t>
+      </w:r>
+      <w:r>
+        <w:rPr>
+          <w:rFonts w:ascii="Poppins" w:hAnsi="Poppins" w:cs="Poppins"/>
+          <w:b/>
+          <w:bCs/>
+        </w:rPr>
+        <w:t>z</w:t>
+      </w:r>
+      <w:r>
+        <w:rPr>
+          <w:rFonts w:ascii="Poppins" w:hAnsi="Poppins" w:cs="Poppins"/>
+          <w:b/>
+          <w:bCs/>
+        </w:rPr>
+        <w:t xml:space="preserve"> le fichier php.ini</w:t>
+      </w:r>
+      <w:r>
+        <w:rPr>
+          <w:rFonts w:ascii="Poppins" w:hAnsi="Poppins" w:cs="Poppins"/>
+        </w:rPr>
+        <w:t xml:space="preserve"> et </w:t>
+      </w:r>
+      <w:r>
+        <w:rPr>
+          <w:rFonts w:ascii="Poppins" w:hAnsi="Poppins" w:cs="Poppins"/>
+          <w:b/>
+          <w:bCs/>
+        </w:rPr>
+        <w:t>effectu</w:t>
+      </w:r>
+      <w:r>
+        <w:rPr>
+          <w:rFonts w:ascii="Poppins" w:hAnsi="Poppins" w:cs="Poppins"/>
+          <w:b/>
+          <w:bCs/>
+        </w:rPr>
+        <w:t>ez</w:t>
+      </w:r>
+      <w:r>
+        <w:rPr>
+          <w:rFonts w:ascii="Poppins" w:hAnsi="Poppins" w:cs="Poppins"/>
+          <w:b/>
+          <w:bCs/>
+        </w:rPr>
+        <w:t xml:space="preserve"> ces modifications :</w:t>
+      </w:r>
+    </w:p>
+    <w:p>
+      <w:pPr>
+        <w:jc w:val="both"/>
+        <w:rPr>
+          <w:rFonts w:ascii="Poppins" w:hAnsi="Poppins" w:cs="Poppins"/>
+        </w:rPr>
+      </w:pPr>
+      <w:r>
+        <w:rPr>
+          <w:rFonts w:ascii="Poppins" w:hAnsi="Poppins" w:cs="Poppins"/>
+        </w:rPr>
+        <w:t xml:space="preserve">Pour un environnement comme </w:t>
+      </w:r>
+      <w:r>
+        <w:rPr>
+          <w:rFonts w:ascii="Poppins" w:hAnsi="Poppins" w:cs="Poppins"/>
+          <w:b/>
+          <w:bCs/>
+        </w:rPr>
+        <w:t>WampServer</w:t>
+      </w:r>
+      <w:r>
+        <w:rPr>
+          <w:rFonts w:ascii="Poppins" w:hAnsi="Poppins" w:cs="Poppins"/>
+        </w:rPr>
+        <w:t> :</w:t>
+      </w:r>
+    </w:p>
+    <w:p>
+      <w:pPr>
+        <w:jc w:val="both"/>
+        <w:rPr>
+          <w:rFonts w:ascii="Poppins" w:hAnsi="Poppins" w:cs="Poppins"/>
+        </w:rPr>
+      </w:pPr>
+    </w:p>
+    <w:p>
+      <w:pPr>
+        <w:pStyle w:val="Paragraphedeliste"/>
+        <w:numPr>
+          <w:ilvl w:val="0"/>
+          <w:numId w:val="2"/>
+        </w:numPr>
+        <w:jc w:val="both"/>
+        <w:rPr>
+          <w:rFonts w:ascii="Poppins" w:hAnsi="Poppins" w:cs="Poppins"/>
+          <w:b/>
+          <w:bCs/>
+        </w:rPr>
+      </w:pPr>
+      <w:r>
+        <w:rPr>
+          <w:rFonts w:ascii="Poppins" w:hAnsi="Poppins" w:cs="Poppins"/>
+          <w:b/>
+          <w:bCs/>
+        </w:rPr>
+        <w:t>Cliquez sur les icônes cachées</w:t>
+      </w:r>
+    </w:p>
+    <w:p>
+      <w:pPr>
+        <w:jc w:val="center"/>
+        <w:rPr>
+          <w:rFonts w:ascii="Poppins" w:hAnsi="Poppins" w:cs="Poppins"/>
+        </w:rPr>
+      </w:pPr>
+      <w:r>
+        <w:rPr>
+          <w:rFonts w:ascii="Poppins" w:hAnsi="Poppins" w:cs="Poppins"/>
+        </w:rPr>
+        <w:drawing>
+          <wp:inline distT="0" distB="0" distL="0" distR="0" wp14:anchorId="3D6299DB" wp14:editId="74CADBB3">
+            <wp:extent cx="3991532" cy="685896"/>
+            <wp:effectExtent l="0" t="0" r="0" b="0"/>
+            <wp:docPr id="1779648411" name="Image 1" descr="Une image contenant texte, capture d’écran, Police&#10;&#10;Le contenu généré par l’IA peut être incorrect."/>
+            <wp:cNvGraphicFramePr>
+              <a:graphicFrameLocks xmlns:a="http://schemas.openxmlformats.org/drawingml/2006/main" noChangeAspect="1"/>
+            </wp:cNvGraphicFramePr>
+            <a:graphic xmlns:a="http://schemas.openxmlformats.org/drawingml/2006/main">
+              <a:graphicData uri="http://schemas.openxmlformats.org/drawingml/2006/picture">
+                <pic:pic xmlns:pic="http://schemas.openxmlformats.org/drawingml/2006/picture">
+                  <pic:nvPicPr>
+                    <pic:cNvPr id="1779648411" name="Image 1" descr="Une image contenant texte, capture d’écran, Police&#10;&#10;Le contenu généré par l’IA peut être incorrect."/>
+                    <pic:cNvPicPr/>
+                  </pic:nvPicPr>
+                  <pic:blipFill>
+                    <a:blip r:embed="rId10"/>
+                    <a:stretch>
+                      <a:fillRect/>
+                    </a:stretch>
+                  </pic:blipFill>
+                  <pic:spPr>
+                    <a:xfrm>
+                      <a:off x="0" y="0"/>
+                      <a:ext cx="3991532" cy="685896"/>
+                    </a:xfrm>
+                    <a:prstGeom prst="rect">
+                      <a:avLst/>
+                    </a:prstGeom>
+                  </pic:spPr>
+                </pic:pic>
+              </a:graphicData>
+            </a:graphic>
+          </wp:inline>
+        </w:drawing>
+      </w:r>
+    </w:p>
+    <w:p>
+      <w:pPr>
+        <w:jc w:val="both"/>
+        <w:rPr>
+          <w:rFonts w:ascii="Poppins" w:hAnsi="Poppins" w:cs="Poppins"/>
+        </w:rPr>
+      </w:pPr>
+    </w:p>
+    <w:p>
+      <w:pPr>
+        <w:pStyle w:val="Paragraphedeliste"/>
+        <w:numPr>
+          <w:ilvl w:val="0"/>
+          <w:numId w:val="2"/>
+        </w:numPr>
+        <w:jc w:val="both"/>
+        <w:rPr>
+          <w:rFonts w:ascii="Poppins" w:hAnsi="Poppins" w:cs="Poppins"/>
+          <w:b/>
+          <w:bCs/>
+        </w:rPr>
+      </w:pPr>
+      <w:r>
+        <w:rPr>
+          <w:rFonts w:ascii="Poppins" w:hAnsi="Poppins" w:cs="Poppins"/>
+          <w:b/>
+          <w:bCs/>
+        </w:rPr>
+        <w:t>Cl</w:t>
+      </w:r>
+      <w:r>
+        <w:rPr>
+          <w:rFonts w:ascii="Poppins" w:hAnsi="Poppins" w:cs="Poppins"/>
+          <w:b/>
+          <w:bCs/>
+        </w:rPr>
+        <w:t>ic</w:t>
+      </w:r>
+      <w:r>
+        <w:rPr>
+          <w:rFonts w:ascii="Poppins" w:hAnsi="Poppins" w:cs="Poppins"/>
+          <w:b/>
+          <w:bCs/>
+        </w:rPr>
+        <w:t xml:space="preserve"> gauche</w:t>
+      </w:r>
+      <w:r>
+        <w:rPr>
+          <w:rFonts w:ascii="Poppins" w:hAnsi="Poppins" w:cs="Poppins"/>
+          <w:b/>
+          <w:bCs/>
+        </w:rPr>
+        <w:t xml:space="preserve"> de la souris</w:t>
+      </w:r>
+      <w:r>
+        <w:rPr>
+          <w:rFonts w:ascii="Poppins" w:hAnsi="Poppins" w:cs="Poppins"/>
+          <w:b/>
+          <w:bCs/>
+        </w:rPr>
+        <w:t xml:space="preserve"> sur le logo wamp </w:t>
+      </w:r>
+    </w:p>
+    <w:p>
+      <w:pPr>
+        <w:ind w:left="360"/>
+        <w:jc w:val="center"/>
+        <w:rPr>
+          <w:rFonts w:ascii="Poppins" w:hAnsi="Poppins" w:cs="Poppins"/>
+          <w:b/>
+          <w:bCs/>
+        </w:rPr>
+      </w:pPr>
+      <w:r>
+        <w:rPr>
+          <w:rFonts w:ascii="Poppins" w:hAnsi="Poppins" w:cs="Poppins"/>
           <w:noProof/>
         </w:rPr>
         <w:drawing>
-          <wp:anchor distT="0" distB="0" distL="114300" distR="114300" simplePos="0" relativeHeight="251659264" behindDoc="0" locked="0" layoutInCell="1" allowOverlap="1" wp14:anchorId="49125B23" wp14:editId="603F23E1">
-            <wp:simplePos x="0" y="0"/>
-            <wp:positionH relativeFrom="column">
-              <wp:posOffset>2719705</wp:posOffset>
-            </wp:positionH>
-            <wp:positionV relativeFrom="paragraph">
-              <wp:posOffset>501015</wp:posOffset>
-            </wp:positionV>
+          <wp:inline distT="0" distB="0" distL="0" distR="0" wp14:anchorId="49125B23" wp14:editId="0180322E">
             <wp:extent cx="743054" cy="352474"/>
             <wp:effectExtent l="0" t="0" r="0" b="9525"/>
-            <wp:wrapNone/>
             <wp:docPr id="2079858541" name="Image 1"/>
             <wp:cNvGraphicFramePr>
               <a:graphicFrameLocks xmlns:a="http://schemas.openxmlformats.org/drawingml/2006/main" noChangeAspect="1"/>
@@ -295,7 +1118,7 @@
                     <pic:cNvPicPr/>
                   </pic:nvPicPr>
                   <pic:blipFill>
-                    <a:blip r:embed="rId6">
+                    <a:blip r:embed="rId11">
                       <a:extLst>
                         <a:ext uri="{28A0092B-C50C-407E-A947-70E740481C1C}">
                           <a14:useLocalDpi xmlns:a14="http://schemas.microsoft.com/office/drawing/2010/main" val="0"/>
@@ -318,21 +1141,8 @@
                 </pic:pic>
               </a:graphicData>
             </a:graphic>
-          </wp:anchor>
+          </wp:inline>
         </w:drawing>
-      </w:r>
-      <w:r>
-        <w:t xml:space="preserve">Pour un environnement comme </w:t>
-      </w:r>
-      <w:r>
-        <w:rPr>
-          <w:b/>
-          <w:bCs/>
-        </w:rPr>
-        <w:t>WampServer</w:t>
-      </w:r>
-      <w:r>
-        <w:t> :</w:t>
       </w:r>
     </w:p>
     <w:p>
@@ -342,74 +1152,47 @@
           <w:ilvl w:val="0"/>
           <w:numId w:val="2"/>
         </w:numPr>
-        <w:rPr>
-          <w:b/>
-          <w:bCs/>
-        </w:rPr>
-      </w:pPr>
-      <w:r>
-        <w:rPr>
-          <w:b/>
-          <w:bCs/>
-        </w:rPr>
-        <w:t>Cl</w:t>
-      </w:r>
-      <w:r>
-        <w:rPr>
-          <w:b/>
-          <w:bCs/>
-        </w:rPr>
-        <w:t>ic</w:t>
-      </w:r>
-      <w:r>
-        <w:rPr>
-          <w:b/>
-          <w:bCs/>
-        </w:rPr>
-        <w:t xml:space="preserve"> gauche sur le logo </w:t>
-      </w:r>
-      <w:proofErr w:type="spellStart"/>
-      <w:r>
-        <w:rPr>
-          <w:b/>
-          <w:bCs/>
-        </w:rPr>
-        <w:t>wamp</w:t>
-      </w:r>
-      <w:proofErr w:type="spellEnd"/>
-      <w:r>
-        <w:rPr>
-          <w:b/>
-          <w:bCs/>
+        <w:jc w:val="both"/>
+        <w:rPr>
+          <w:rFonts w:ascii="Poppins" w:hAnsi="Poppins" w:cs="Poppins"/>
+          <w:b/>
+          <w:bCs/>
+        </w:rPr>
+      </w:pPr>
+      <w:r>
+        <w:rPr>
+          <w:rFonts w:ascii="Poppins" w:hAnsi="Poppins" w:cs="Poppins"/>
+          <w:b/>
+          <w:bCs/>
+        </w:rPr>
+        <w:t>Php</w:t>
+      </w:r>
+      <w:r>
+        <w:rPr>
+          <w:rFonts w:ascii="Poppins" w:hAnsi="Poppins" w:cs="Poppins"/>
+          <w:b/>
+          <w:bCs/>
+          <w:noProof/>
         </w:rPr>
         <w:t xml:space="preserve"> </w:t>
       </w:r>
     </w:p>
     <w:p>
-      <w:r>
-        <w:rPr>
+      <w:pPr>
+        <w:jc w:val="center"/>
+        <w:rPr>
+          <w:rFonts w:ascii="Poppins" w:hAnsi="Poppins" w:cs="Poppins"/>
+        </w:rPr>
+      </w:pPr>
+      <w:r>
+        <w:rPr>
+          <w:rFonts w:ascii="Poppins" w:hAnsi="Poppins" w:cs="Poppins"/>
           <w:noProof/>
         </w:rPr>
         <w:drawing>
-          <wp:anchor distT="0" distB="0" distL="114300" distR="114300" simplePos="0" relativeHeight="251660288" behindDoc="0" locked="0" layoutInCell="1" allowOverlap="1" wp14:anchorId="71506A98" wp14:editId="7B785953">
-            <wp:simplePos x="0" y="0"/>
-            <wp:positionH relativeFrom="column">
-              <wp:posOffset>2405380</wp:posOffset>
-            </wp:positionH>
-            <wp:positionV relativeFrom="paragraph">
-              <wp:posOffset>22225</wp:posOffset>
-            </wp:positionV>
+          <wp:inline distT="0" distB="0" distL="0" distR="0" wp14:anchorId="71506A98" wp14:editId="46FD46FE">
             <wp:extent cx="1409700" cy="2212975"/>
             <wp:effectExtent l="0" t="0" r="0" b="0"/>
-            <wp:wrapThrough wrapText="bothSides">
-              <wp:wrapPolygon edited="0">
-                <wp:start x="0" y="0"/>
-                <wp:lineTo x="0" y="21383"/>
-                <wp:lineTo x="21308" y="21383"/>
-                <wp:lineTo x="21308" y="0"/>
-                <wp:lineTo x="0" y="0"/>
-              </wp:wrapPolygon>
-            </wp:wrapThrough>
             <wp:docPr id="1118133884" name="Image 1" descr="Une image contenant texte, Appareils électroniques, capture d’écran, logiciel&#10;&#10;Le contenu généré par l’IA peut être incorrect."/>
             <wp:cNvGraphicFramePr>
               <a:graphicFrameLocks xmlns:a="http://schemas.openxmlformats.org/drawingml/2006/main" noChangeAspect="1"/>
@@ -422,7 +1205,7 @@
                     <pic:cNvPicPr/>
                   </pic:nvPicPr>
                   <pic:blipFill>
-                    <a:blip r:embed="rId7">
+                    <a:blip r:embed="rId12">
                       <a:extLst>
                         <a:ext uri="{28A0092B-C50C-407E-A947-70E740481C1C}">
                           <a14:useLocalDpi xmlns:a14="http://schemas.microsoft.com/office/drawing/2010/main" val="0"/>
@@ -445,17 +1228,10 @@
                 </pic:pic>
               </a:graphicData>
             </a:graphic>
-            <wp14:sizeRelH relativeFrom="margin">
-              <wp14:pctWidth>0</wp14:pctWidth>
-            </wp14:sizeRelH>
-            <wp14:sizeRelV relativeFrom="margin">
-              <wp14:pctHeight>0</wp14:pctHeight>
-            </wp14:sizeRelV>
-          </wp:anchor>
+          </wp:inline>
         </w:drawing>
       </w:r>
     </w:p>
-    <w:p/>
     <w:p>
       <w:pPr>
         <w:pStyle w:val="Paragraphedeliste"/>
@@ -463,55 +1239,39 @@
           <w:ilvl w:val="0"/>
           <w:numId w:val="2"/>
         </w:numPr>
-        <w:rPr>
-          <w:b/>
-          <w:bCs/>
-        </w:rPr>
-      </w:pPr>
-      <w:proofErr w:type="spellStart"/>
-      <w:r>
-        <w:rPr>
-          <w:b/>
-          <w:bCs/>
-        </w:rPr>
-        <w:t>Php</w:t>
-      </w:r>
-      <w:proofErr w:type="spellEnd"/>
-      <w:r>
-        <w:rPr>
-          <w:b/>
-          <w:bCs/>
+        <w:jc w:val="both"/>
+        <w:rPr>
+          <w:rFonts w:ascii="Poppins" w:hAnsi="Poppins" w:cs="Poppins"/>
+          <w:b/>
+          <w:bCs/>
+        </w:rPr>
+      </w:pPr>
+      <w:r>
+        <w:rPr>
+          <w:rFonts w:ascii="Poppins" w:hAnsi="Poppins" w:cs="Poppins"/>
+          <w:b/>
+          <w:bCs/>
+        </w:rPr>
+        <w:t>Php.ini</w:t>
+      </w:r>
+    </w:p>
+    <w:p>
+      <w:pPr>
+        <w:jc w:val="center"/>
+        <w:rPr>
+          <w:rFonts w:ascii="Poppins" w:hAnsi="Poppins" w:cs="Poppins"/>
+        </w:rPr>
+      </w:pPr>
+      <w:r>
+        <w:rPr>
+          <w:rFonts w:ascii="Poppins" w:hAnsi="Poppins" w:cs="Poppins"/>
           <w:noProof/>
         </w:rPr>
-        <w:t xml:space="preserve"> </w:t>
-      </w:r>
-    </w:p>
-    <w:p/>
-    <w:p/>
-    <w:p/>
-    <w:p>
-      <w:r>
-        <w:br w:type="page"/>
-      </w:r>
-    </w:p>
-    <w:p/>
-    <w:p>
-      <w:r>
-        <w:rPr>
-          <w:noProof/>
-        </w:rPr>
+        <w:lastRenderedPageBreak/>
         <w:drawing>
-          <wp:anchor distT="0" distB="0" distL="114300" distR="114300" simplePos="0" relativeHeight="251661312" behindDoc="0" locked="0" layoutInCell="1" allowOverlap="1" wp14:anchorId="2EBE9770" wp14:editId="0ED0E9D5">
-            <wp:simplePos x="0" y="0"/>
-            <wp:positionH relativeFrom="column">
-              <wp:posOffset>1557020</wp:posOffset>
-            </wp:positionH>
-            <wp:positionV relativeFrom="paragraph">
-              <wp:posOffset>165100</wp:posOffset>
-            </wp:positionV>
+          <wp:inline distT="0" distB="0" distL="0" distR="0" wp14:anchorId="02A36DD9" wp14:editId="52B9D2BB">
             <wp:extent cx="2981325" cy="2594585"/>
             <wp:effectExtent l="0" t="0" r="0" b="0"/>
-            <wp:wrapNone/>
             <wp:docPr id="1818145691" name="Image 1" descr="Une image contenant texte, capture d’écran, logiciel, Icône d’ordinateur&#10;&#10;Le contenu généré par l’IA peut être incorrect."/>
             <wp:cNvGraphicFramePr>
               <a:graphicFrameLocks xmlns:a="http://schemas.openxmlformats.org/drawingml/2006/main" noChangeAspect="1"/>
@@ -524,7 +1284,7 @@
                     <pic:cNvPicPr/>
                   </pic:nvPicPr>
                   <pic:blipFill>
-                    <a:blip r:embed="rId8">
+                    <a:blip r:embed="rId13">
                       <a:extLst>
                         <a:ext uri="{28A0092B-C50C-407E-A947-70E740481C1C}">
                           <a14:useLocalDpi xmlns:a14="http://schemas.microsoft.com/office/drawing/2010/main" val="0"/>
@@ -547,19 +1307,10 @@
                 </pic:pic>
               </a:graphicData>
             </a:graphic>
-            <wp14:sizeRelH relativeFrom="margin">
-              <wp14:pctWidth>0</wp14:pctWidth>
-            </wp14:sizeRelH>
-            <wp14:sizeRelV relativeFrom="margin">
-              <wp14:pctHeight>0</wp14:pctHeight>
-            </wp14:sizeRelV>
-          </wp:anchor>
+          </wp:inline>
         </w:drawing>
       </w:r>
     </w:p>
-    <w:p/>
-    <w:p/>
-    <w:p/>
     <w:p>
       <w:pPr>
         <w:pStyle w:val="Paragraphedeliste"/>
@@ -567,74 +1318,20 @@
           <w:ilvl w:val="0"/>
           <w:numId w:val="2"/>
         </w:numPr>
-        <w:rPr>
-          <w:b/>
-          <w:bCs/>
-        </w:rPr>
-      </w:pPr>
-      <w:r>
-        <w:rPr>
-          <w:b/>
-          <w:bCs/>
-        </w:rPr>
-        <w:t>Php.ini</w:t>
-      </w:r>
-    </w:p>
-    <w:p/>
-    <w:p/>
-    <w:p/>
-    <w:p/>
-    <w:p/>
-    <w:p>
-      <w:pPr>
-        <w:pStyle w:val="Paragraphedeliste"/>
-        <w:numPr>
-          <w:ilvl w:val="0"/>
-          <w:numId w:val="2"/>
-        </w:numPr>
-        <w:rPr>
-          <w:b/>
-          <w:bCs/>
-        </w:rPr>
-      </w:pPr>
-      <w:r>
-        <w:rPr>
-          <w:b/>
-          <w:bCs/>
-        </w:rPr>
-        <w:t xml:space="preserve">Une fois dans </w:t>
-      </w:r>
-      <w:proofErr w:type="spellStart"/>
-      <w:r>
-        <w:rPr>
-          <w:b/>
-          <w:bCs/>
-        </w:rPr>
-        <w:t>php</w:t>
-      </w:r>
-      <w:proofErr w:type="spellEnd"/>
-      <w:r>
-        <w:rPr>
-          <w:b/>
-          <w:bCs/>
-        </w:rPr>
-        <w:t> .</w:t>
-      </w:r>
-      <w:proofErr w:type="spellStart"/>
-      <w:r>
-        <w:rPr>
-          <w:b/>
-          <w:bCs/>
-        </w:rPr>
-        <w:t>ini</w:t>
-      </w:r>
-      <w:proofErr w:type="spellEnd"/>
-      <w:r>
-        <w:rPr>
-          <w:b/>
-          <w:bCs/>
-        </w:rPr>
-        <w:t xml:space="preserve"> effectuée un CTRL + F et rechercher :</w:t>
+        <w:jc w:val="both"/>
+        <w:rPr>
+          <w:rFonts w:ascii="Poppins" w:hAnsi="Poppins" w:cs="Poppins"/>
+          <w:b/>
+          <w:bCs/>
+        </w:rPr>
+      </w:pPr>
+      <w:r>
+        <w:rPr>
+          <w:rFonts w:ascii="Poppins" w:hAnsi="Poppins" w:cs="Poppins"/>
+          <w:b/>
+          <w:bCs/>
+        </w:rPr>
+        <w:t>Une fois dans php .ini effectuée un CTRL + F et rechercher :</w:t>
       </w:r>
     </w:p>
     <w:p>
@@ -644,29 +1341,21 @@
           <w:ilvl w:val="1"/>
           <w:numId w:val="1"/>
         </w:numPr>
-        <w:rPr>
-          <w:b/>
-          <w:bCs/>
-        </w:rPr>
-      </w:pPr>
-      <w:proofErr w:type="spellStart"/>
-      <w:proofErr w:type="gramStart"/>
-      <w:r>
-        <w:rPr>
-          <w:b/>
-          <w:bCs/>
-        </w:rPr>
-        <w:t>upload</w:t>
-      </w:r>
-      <w:proofErr w:type="gramEnd"/>
-      <w:r>
-        <w:rPr>
-          <w:b/>
-          <w:bCs/>
-        </w:rPr>
-        <w:t>_max_filesize</w:t>
-      </w:r>
-      <w:proofErr w:type="spellEnd"/>
+        <w:jc w:val="both"/>
+        <w:rPr>
+          <w:rFonts w:ascii="Poppins" w:hAnsi="Poppins" w:cs="Poppins"/>
+          <w:b/>
+          <w:bCs/>
+        </w:rPr>
+      </w:pPr>
+      <w:r>
+        <w:rPr>
+          <w:rFonts w:ascii="Poppins" w:hAnsi="Poppins" w:cs="Poppins"/>
+          <w:b/>
+          <w:bCs/>
+        </w:rPr>
+        <w:t>upload_max_filesize</w:t>
+      </w:r>
     </w:p>
     <w:p>
       <w:pPr>
@@ -675,34 +1364,35 @@
           <w:ilvl w:val="1"/>
           <w:numId w:val="1"/>
         </w:numPr>
-        <w:rPr>
-          <w:b/>
-          <w:bCs/>
-        </w:rPr>
-      </w:pPr>
-      <w:proofErr w:type="spellStart"/>
-      <w:proofErr w:type="gramStart"/>
-      <w:r>
-        <w:rPr>
-          <w:b/>
-          <w:bCs/>
-        </w:rPr>
-        <w:t>post</w:t>
-      </w:r>
-      <w:proofErr w:type="gramEnd"/>
-      <w:r>
-        <w:rPr>
-          <w:b/>
-          <w:bCs/>
-        </w:rPr>
-        <w:t>_max_size</w:t>
-      </w:r>
-      <w:proofErr w:type="spellEnd"/>
+        <w:jc w:val="both"/>
+        <w:rPr>
+          <w:rFonts w:ascii="Poppins" w:hAnsi="Poppins" w:cs="Poppins"/>
+          <w:b/>
+          <w:bCs/>
+        </w:rPr>
+      </w:pPr>
+      <w:r>
+        <w:rPr>
+          <w:rFonts w:ascii="Poppins" w:hAnsi="Poppins" w:cs="Poppins"/>
+          <w:b/>
+          <w:bCs/>
+        </w:rPr>
+        <w:t>post_max_size</w:t>
+      </w:r>
     </w:p>
-    <w:p/>
     <w:p>
       <w:pPr>
-        <w:rPr>
+        <w:jc w:val="both"/>
+        <w:rPr>
+          <w:rFonts w:ascii="Poppins" w:hAnsi="Poppins" w:cs="Poppins"/>
+        </w:rPr>
+      </w:pPr>
+    </w:p>
+    <w:p>
+      <w:pPr>
+        <w:jc w:val="both"/>
+        <w:rPr>
+          <w:rFonts w:ascii="Poppins" w:hAnsi="Poppins" w:cs="Poppins"/>
           <w:b/>
           <w:bCs/>
           <w:sz w:val="28"/>
@@ -711,21 +1401,43 @@
       </w:pPr>
       <w:r>
         <w:rPr>
+          <w:rFonts w:ascii="Poppins" w:hAnsi="Poppins" w:cs="Poppins"/>
           <w:b/>
           <w:bCs/>
           <w:sz w:val="28"/>
           <w:szCs w:val="28"/>
         </w:rPr>
-        <w:t>Modifiée ces lignes comme dans l’exemple</w:t>
-      </w:r>
-      <w:r>
-        <w:rPr>
+        <w:t>Modifi</w:t>
+      </w:r>
+      <w:r>
+        <w:rPr>
+          <w:rFonts w:ascii="Poppins" w:hAnsi="Poppins" w:cs="Poppins"/>
           <w:b/>
           <w:bCs/>
           <w:sz w:val="28"/>
           <w:szCs w:val="28"/>
         </w:rPr>
-        <w:t>.</w:t>
+        <w:t>ez</w:t>
+      </w:r>
+      <w:r>
+        <w:rPr>
+          <w:rFonts w:ascii="Poppins" w:hAnsi="Poppins" w:cs="Poppins"/>
+          <w:b/>
+          <w:bCs/>
+          <w:sz w:val="28"/>
+          <w:szCs w:val="28"/>
+        </w:rPr>
+        <w:t xml:space="preserve"> ces lignes comme dans l’exemple</w:t>
+      </w:r>
+      <w:r>
+        <w:rPr>
+          <w:rFonts w:ascii="Poppins" w:hAnsi="Poppins" w:cs="Poppins"/>
+          <w:b/>
+          <w:bCs/>
+          <w:sz w:val="28"/>
+          <w:szCs w:val="28"/>
+        </w:rPr>
+        <w:t xml:space="preserve"> suivant</w:t>
       </w:r>
     </w:p>
     <w:p>
@@ -735,20 +1447,29 @@
           <w:ilvl w:val="0"/>
           <w:numId w:val="3"/>
         </w:numPr>
-      </w:pPr>
-      <w:r>
+        <w:jc w:val="both"/>
+        <w:rPr>
+          <w:rFonts w:ascii="Poppins" w:hAnsi="Poppins" w:cs="Poppins"/>
+        </w:rPr>
+      </w:pPr>
+      <w:r>
+        <w:rPr>
+          <w:rFonts w:ascii="Poppins" w:hAnsi="Poppins" w:cs="Poppins"/>
+        </w:rPr>
         <w:t xml:space="preserve">Exemple pour </w:t>
       </w:r>
-      <w:proofErr w:type="spellStart"/>
-      <w:r>
-        <w:rPr>
+      <w:r>
+        <w:rPr>
+          <w:rFonts w:ascii="Poppins" w:hAnsi="Poppins" w:cs="Poppins"/>
           <w:b/>
           <w:bCs/>
         </w:rPr>
         <w:t>upload_max_filesize</w:t>
       </w:r>
-      <w:proofErr w:type="spellEnd"/>
-      <w:r>
+      <w:r>
+        <w:rPr>
+          <w:rFonts w:ascii="Poppins" w:hAnsi="Poppins" w:cs="Poppins"/>
+        </w:rPr>
         <w:t xml:space="preserve"> :</w:t>
       </w:r>
     </w:p>
@@ -759,35 +1480,20 @@
           <w:ilvl w:val="1"/>
           <w:numId w:val="3"/>
         </w:numPr>
-        <w:rPr>
-          <w:b/>
-          <w:bCs/>
-        </w:rPr>
-      </w:pPr>
-      <w:proofErr w:type="spellStart"/>
-      <w:proofErr w:type="gramStart"/>
-      <w:r>
-        <w:rPr>
-          <w:b/>
-          <w:bCs/>
-        </w:rPr>
-        <w:t>upload</w:t>
-      </w:r>
-      <w:proofErr w:type="gramEnd"/>
-      <w:r>
-        <w:rPr>
-          <w:b/>
-          <w:bCs/>
-        </w:rPr>
-        <w:t>_max_filesize</w:t>
-      </w:r>
-      <w:proofErr w:type="spellEnd"/>
-      <w:r>
-        <w:rPr>
-          <w:b/>
-          <w:bCs/>
-        </w:rPr>
-        <w:t xml:space="preserve"> = 10M</w:t>
+        <w:jc w:val="both"/>
+        <w:rPr>
+          <w:rFonts w:ascii="Poppins" w:hAnsi="Poppins" w:cs="Poppins"/>
+          <w:b/>
+          <w:bCs/>
+        </w:rPr>
+      </w:pPr>
+      <w:r>
+        <w:rPr>
+          <w:rFonts w:ascii="Poppins" w:hAnsi="Poppins" w:cs="Poppins"/>
+          <w:b/>
+          <w:bCs/>
+        </w:rPr>
+        <w:t>upload_max_filesize = 10M</w:t>
       </w:r>
     </w:p>
     <w:p>
@@ -797,25 +1503,24 @@
           <w:ilvl w:val="0"/>
           <w:numId w:val="3"/>
         </w:numPr>
-      </w:pPr>
-      <w:r>
+        <w:jc w:val="both"/>
+        <w:rPr>
+          <w:rFonts w:ascii="Poppins" w:hAnsi="Poppins" w:cs="Poppins"/>
+        </w:rPr>
+      </w:pPr>
+      <w:r>
+        <w:rPr>
+          <w:rFonts w:ascii="Poppins" w:hAnsi="Poppins" w:cs="Poppins"/>
+        </w:rPr>
         <w:t xml:space="preserve">Exemple pour </w:t>
       </w:r>
-      <w:proofErr w:type="spellStart"/>
-      <w:r>
-        <w:rPr>
-          <w:b/>
-          <w:bCs/>
-        </w:rPr>
-        <w:t>post_max_size</w:t>
-      </w:r>
-      <w:proofErr w:type="spellEnd"/>
-      <w:r>
-        <w:rPr>
-          <w:b/>
-          <w:bCs/>
-        </w:rPr>
-        <w:t> :</w:t>
+      <w:r>
+        <w:rPr>
+          <w:rFonts w:ascii="Poppins" w:hAnsi="Poppins" w:cs="Poppins"/>
+          <w:b/>
+          <w:bCs/>
+        </w:rPr>
+        <w:t>post_max_size :</w:t>
       </w:r>
     </w:p>
     <w:p>
@@ -825,43 +1530,555 @@
           <w:ilvl w:val="1"/>
           <w:numId w:val="3"/>
         </w:numPr>
-        <w:rPr>
-          <w:b/>
-          <w:bCs/>
-        </w:rPr>
-      </w:pPr>
-      <w:proofErr w:type="spellStart"/>
-      <w:proofErr w:type="gramStart"/>
-      <w:r>
-        <w:rPr>
-          <w:b/>
-          <w:bCs/>
-        </w:rPr>
-        <w:t>post</w:t>
-      </w:r>
-      <w:proofErr w:type="gramEnd"/>
-      <w:r>
-        <w:rPr>
-          <w:b/>
-          <w:bCs/>
-        </w:rPr>
-        <w:t>_max_size</w:t>
-      </w:r>
-      <w:proofErr w:type="spellEnd"/>
-      <w:r>
-        <w:rPr>
-          <w:b/>
-          <w:bCs/>
-        </w:rPr>
-        <w:t xml:space="preserve"> = 20M</w:t>
+        <w:jc w:val="both"/>
+        <w:rPr>
+          <w:rFonts w:ascii="Poppins" w:hAnsi="Poppins" w:cs="Poppins"/>
+          <w:b/>
+          <w:bCs/>
+        </w:rPr>
+      </w:pPr>
+      <w:r>
+        <w:rPr>
+          <w:rFonts w:ascii="Poppins" w:hAnsi="Poppins" w:cs="Poppins"/>
+          <w:b/>
+          <w:bCs/>
+        </w:rPr>
+        <w:t>post_max_size = 20M</w:t>
       </w:r>
     </w:p>
-    <w:p/>
-    <w:p/>
-    <w:p/>
-    <w:p/>
-    <w:p/>
+    <w:p>
+      <w:pPr>
+        <w:jc w:val="both"/>
+        <w:rPr>
+          <w:rFonts w:ascii="Poppins" w:hAnsi="Poppins" w:cs="Poppins"/>
+          <w:b/>
+          <w:bCs/>
+        </w:rPr>
+      </w:pPr>
+    </w:p>
+    <w:tbl>
+      <w:tblPr>
+        <w:tblW w:w="9056" w:type="dxa"/>
+        <w:tblBorders>
+          <w:top w:val="outset" w:sz="6" w:space="0" w:color="auto"/>
+          <w:left w:val="outset" w:sz="6" w:space="0" w:color="auto"/>
+          <w:bottom w:val="outset" w:sz="6" w:space="0" w:color="auto"/>
+          <w:right w:val="outset" w:sz="6" w:space="0" w:color="auto"/>
+        </w:tblBorders>
+        <w:tblCellMar>
+          <w:left w:w="0" w:type="dxa"/>
+          <w:right w:w="0" w:type="dxa"/>
+        </w:tblCellMar>
+        <w:tblLook w:val="04A0" w:firstRow="1" w:lastRow="0" w:firstColumn="1" w:lastColumn="0" w:noHBand="0" w:noVBand="1"/>
+      </w:tblPr>
+      <w:tblGrid>
+        <w:gridCol w:w="1049"/>
+        <w:gridCol w:w="1388"/>
+        <w:gridCol w:w="1569"/>
+        <w:gridCol w:w="1565"/>
+        <w:gridCol w:w="3485"/>
+      </w:tblGrid>
+      <w:tr>
+        <w:trPr>
+          <w:trHeight w:val="300"/>
+        </w:trPr>
+        <w:tc>
+          <w:tcPr>
+            <w:tcW w:w="9056" w:type="dxa"/>
+            <w:gridSpan w:val="5"/>
+            <w:tcBorders>
+              <w:top w:val="single" w:sz="6" w:space="0" w:color="auto"/>
+              <w:left w:val="single" w:sz="6" w:space="0" w:color="auto"/>
+              <w:bottom w:val="single" w:sz="6" w:space="0" w:color="auto"/>
+              <w:right w:val="single" w:sz="6" w:space="0" w:color="auto"/>
+            </w:tcBorders>
+            <w:shd w:val="clear" w:color="auto" w:fill="112250"/>
+            <w:hideMark/>
+          </w:tcPr>
+          <w:p>
+            <w:pPr>
+              <w:jc w:val="both"/>
+              <w:rPr>
+                <w:rFonts w:ascii="Poppins" w:hAnsi="Poppins" w:cs="Poppins"/>
+              </w:rPr>
+            </w:pPr>
+            <w:r>
+              <w:rPr>
+                <w:rFonts w:ascii="Poppins" w:hAnsi="Poppins" w:cs="Poppins"/>
+                <w:b/>
+                <w:bCs/>
+                <w:color w:val="F5F0E9"/>
+              </w:rPr>
+              <w:t>Suivi des modifications</w:t>
+            </w:r>
+            <w:r>
+              <w:rPr>
+                <w:rFonts w:ascii="Poppins" w:hAnsi="Poppins" w:cs="Poppins"/>
+                <w:color w:val="F5F0E9"/>
+              </w:rPr>
+              <w:t> </w:t>
+            </w:r>
+          </w:p>
+        </w:tc>
+      </w:tr>
+      <w:tr>
+        <w:trPr>
+          <w:trHeight w:val="300"/>
+        </w:trPr>
+        <w:tc>
+          <w:tcPr>
+            <w:tcW w:w="1050" w:type="dxa"/>
+            <w:tcBorders>
+              <w:top w:val="single" w:sz="6" w:space="0" w:color="auto"/>
+              <w:left w:val="single" w:sz="6" w:space="0" w:color="auto"/>
+              <w:bottom w:val="single" w:sz="6" w:space="0" w:color="auto"/>
+              <w:right w:val="single" w:sz="6" w:space="0" w:color="auto"/>
+            </w:tcBorders>
+            <w:hideMark/>
+          </w:tcPr>
+          <w:p>
+            <w:pPr>
+              <w:jc w:val="both"/>
+              <w:rPr>
+                <w:rFonts w:ascii="Poppins" w:hAnsi="Poppins" w:cs="Poppins"/>
+              </w:rPr>
+            </w:pPr>
+            <w:r>
+              <w:rPr>
+                <w:rFonts w:ascii="Poppins" w:hAnsi="Poppins" w:cs="Poppins"/>
+                <w:b/>
+                <w:bCs/>
+              </w:rPr>
+              <w:t>Version</w:t>
+            </w:r>
+            <w:r>
+              <w:rPr>
+                <w:rFonts w:ascii="Poppins" w:hAnsi="Poppins" w:cs="Poppins"/>
+              </w:rPr>
+              <w:t> </w:t>
+            </w:r>
+          </w:p>
+        </w:tc>
+        <w:tc>
+          <w:tcPr>
+            <w:tcW w:w="1320" w:type="dxa"/>
+            <w:tcBorders>
+              <w:top w:val="single" w:sz="6" w:space="0" w:color="auto"/>
+              <w:left w:val="single" w:sz="6" w:space="0" w:color="auto"/>
+              <w:bottom w:val="single" w:sz="6" w:space="0" w:color="auto"/>
+              <w:right w:val="single" w:sz="6" w:space="0" w:color="auto"/>
+            </w:tcBorders>
+            <w:hideMark/>
+          </w:tcPr>
+          <w:p>
+            <w:pPr>
+              <w:jc w:val="both"/>
+              <w:rPr>
+                <w:rFonts w:ascii="Poppins" w:hAnsi="Poppins" w:cs="Poppins"/>
+              </w:rPr>
+            </w:pPr>
+            <w:r>
+              <w:rPr>
+                <w:rFonts w:ascii="Poppins" w:hAnsi="Poppins" w:cs="Poppins"/>
+                <w:b/>
+                <w:bCs/>
+              </w:rPr>
+              <w:t>Date</w:t>
+            </w:r>
+            <w:r>
+              <w:rPr>
+                <w:rFonts w:ascii="Poppins" w:hAnsi="Poppins" w:cs="Poppins"/>
+              </w:rPr>
+              <w:t> </w:t>
+            </w:r>
+          </w:p>
+        </w:tc>
+        <w:tc>
+          <w:tcPr>
+            <w:tcW w:w="1575" w:type="dxa"/>
+            <w:tcBorders>
+              <w:top w:val="single" w:sz="6" w:space="0" w:color="auto"/>
+              <w:left w:val="single" w:sz="6" w:space="0" w:color="auto"/>
+              <w:bottom w:val="single" w:sz="6" w:space="0" w:color="auto"/>
+              <w:right w:val="single" w:sz="6" w:space="0" w:color="auto"/>
+            </w:tcBorders>
+            <w:hideMark/>
+          </w:tcPr>
+          <w:p>
+            <w:pPr>
+              <w:jc w:val="both"/>
+              <w:rPr>
+                <w:rFonts w:ascii="Poppins" w:hAnsi="Poppins" w:cs="Poppins"/>
+              </w:rPr>
+            </w:pPr>
+            <w:r>
+              <w:rPr>
+                <w:rFonts w:ascii="Poppins" w:hAnsi="Poppins" w:cs="Poppins"/>
+                <w:b/>
+                <w:bCs/>
+              </w:rPr>
+              <w:t>Auteur</w:t>
+            </w:r>
+            <w:r>
+              <w:rPr>
+                <w:rFonts w:ascii="Poppins" w:hAnsi="Poppins" w:cs="Poppins"/>
+              </w:rPr>
+              <w:t> </w:t>
+            </w:r>
+          </w:p>
+        </w:tc>
+        <w:tc>
+          <w:tcPr>
+            <w:tcW w:w="1574" w:type="dxa"/>
+            <w:tcBorders>
+              <w:top w:val="single" w:sz="6" w:space="0" w:color="auto"/>
+              <w:left w:val="single" w:sz="6" w:space="0" w:color="auto"/>
+              <w:bottom w:val="single" w:sz="6" w:space="0" w:color="auto"/>
+              <w:right w:val="single" w:sz="6" w:space="0" w:color="auto"/>
+            </w:tcBorders>
+            <w:hideMark/>
+          </w:tcPr>
+          <w:p>
+            <w:pPr>
+              <w:jc w:val="both"/>
+              <w:rPr>
+                <w:rFonts w:ascii="Poppins" w:hAnsi="Poppins" w:cs="Poppins"/>
+              </w:rPr>
+            </w:pPr>
+            <w:r>
+              <w:rPr>
+                <w:rFonts w:ascii="Poppins" w:hAnsi="Poppins" w:cs="Poppins"/>
+                <w:b/>
+                <w:bCs/>
+              </w:rPr>
+              <w:t>Validation par</w:t>
+            </w:r>
+            <w:r>
+              <w:rPr>
+                <w:rFonts w:ascii="Poppins" w:hAnsi="Poppins" w:cs="Poppins"/>
+              </w:rPr>
+              <w:t> </w:t>
+            </w:r>
+          </w:p>
+        </w:tc>
+        <w:tc>
+          <w:tcPr>
+            <w:tcW w:w="3537" w:type="dxa"/>
+            <w:tcBorders>
+              <w:top w:val="single" w:sz="6" w:space="0" w:color="auto"/>
+              <w:left w:val="single" w:sz="6" w:space="0" w:color="auto"/>
+              <w:bottom w:val="single" w:sz="6" w:space="0" w:color="auto"/>
+              <w:right w:val="single" w:sz="6" w:space="0" w:color="auto"/>
+            </w:tcBorders>
+            <w:hideMark/>
+          </w:tcPr>
+          <w:p>
+            <w:pPr>
+              <w:jc w:val="both"/>
+              <w:rPr>
+                <w:rFonts w:ascii="Poppins" w:hAnsi="Poppins" w:cs="Poppins"/>
+              </w:rPr>
+            </w:pPr>
+            <w:r>
+              <w:rPr>
+                <w:rFonts w:ascii="Poppins" w:hAnsi="Poppins" w:cs="Poppins"/>
+                <w:b/>
+                <w:bCs/>
+              </w:rPr>
+              <w:t>Objet</w:t>
+            </w:r>
+            <w:r>
+              <w:rPr>
+                <w:rFonts w:ascii="Poppins" w:hAnsi="Poppins" w:cs="Poppins"/>
+              </w:rPr>
+              <w:t> </w:t>
+            </w:r>
+          </w:p>
+        </w:tc>
+      </w:tr>
+      <w:tr>
+        <w:trPr>
+          <w:trHeight w:val="300"/>
+        </w:trPr>
+        <w:tc>
+          <w:tcPr>
+            <w:tcW w:w="1050" w:type="dxa"/>
+            <w:tcBorders>
+              <w:top w:val="single" w:sz="6" w:space="0" w:color="auto"/>
+              <w:left w:val="single" w:sz="6" w:space="0" w:color="auto"/>
+              <w:bottom w:val="single" w:sz="6" w:space="0" w:color="auto"/>
+              <w:right w:val="single" w:sz="6" w:space="0" w:color="auto"/>
+            </w:tcBorders>
+            <w:hideMark/>
+          </w:tcPr>
+          <w:p>
+            <w:pPr>
+              <w:jc w:val="both"/>
+              <w:rPr>
+                <w:rFonts w:ascii="Poppins" w:hAnsi="Poppins" w:cs="Poppins"/>
+              </w:rPr>
+            </w:pPr>
+            <w:r>
+              <w:rPr>
+                <w:rFonts w:ascii="Poppins" w:hAnsi="Poppins" w:cs="Poppins"/>
+              </w:rPr>
+              <w:t>V1 </w:t>
+            </w:r>
+          </w:p>
+        </w:tc>
+        <w:tc>
+          <w:tcPr>
+            <w:tcW w:w="1320" w:type="dxa"/>
+            <w:tcBorders>
+              <w:top w:val="single" w:sz="6" w:space="0" w:color="auto"/>
+              <w:left w:val="single" w:sz="6" w:space="0" w:color="auto"/>
+              <w:bottom w:val="single" w:sz="6" w:space="0" w:color="auto"/>
+              <w:right w:val="single" w:sz="6" w:space="0" w:color="auto"/>
+            </w:tcBorders>
+            <w:hideMark/>
+          </w:tcPr>
+          <w:p>
+            <w:pPr>
+              <w:jc w:val="both"/>
+              <w:rPr>
+                <w:rFonts w:ascii="Poppins" w:hAnsi="Poppins" w:cs="Poppins"/>
+              </w:rPr>
+            </w:pPr>
+            <w:r>
+              <w:rPr>
+                <w:rFonts w:ascii="Poppins" w:hAnsi="Poppins" w:cs="Poppins"/>
+              </w:rPr>
+              <w:t>18/01/2026</w:t>
+            </w:r>
+          </w:p>
+        </w:tc>
+        <w:tc>
+          <w:tcPr>
+            <w:tcW w:w="1575" w:type="dxa"/>
+            <w:tcBorders>
+              <w:top w:val="single" w:sz="6" w:space="0" w:color="auto"/>
+              <w:left w:val="single" w:sz="6" w:space="0" w:color="auto"/>
+              <w:bottom w:val="single" w:sz="6" w:space="0" w:color="auto"/>
+              <w:right w:val="single" w:sz="6" w:space="0" w:color="auto"/>
+            </w:tcBorders>
+            <w:hideMark/>
+          </w:tcPr>
+          <w:p>
+            <w:pPr>
+              <w:jc w:val="both"/>
+              <w:rPr>
+                <w:rFonts w:ascii="Poppins" w:hAnsi="Poppins" w:cs="Poppins"/>
+              </w:rPr>
+            </w:pPr>
+            <w:r>
+              <w:rPr>
+                <w:rFonts w:ascii="Poppins" w:hAnsi="Poppins" w:cs="Poppins"/>
+              </w:rPr>
+              <w:t>BARTHOUX-SAUZE T.</w:t>
+            </w:r>
+            <w:r>
+              <w:rPr>
+                <w:rFonts w:ascii="Poppins" w:hAnsi="Poppins" w:cs="Poppins"/>
+              </w:rPr>
+              <w:t> </w:t>
+            </w:r>
+          </w:p>
+        </w:tc>
+        <w:tc>
+          <w:tcPr>
+            <w:tcW w:w="1574" w:type="dxa"/>
+            <w:tcBorders>
+              <w:top w:val="single" w:sz="6" w:space="0" w:color="auto"/>
+              <w:left w:val="single" w:sz="6" w:space="0" w:color="auto"/>
+              <w:bottom w:val="single" w:sz="6" w:space="0" w:color="auto"/>
+              <w:right w:val="single" w:sz="6" w:space="0" w:color="auto"/>
+            </w:tcBorders>
+            <w:hideMark/>
+          </w:tcPr>
+          <w:p>
+            <w:pPr>
+              <w:jc w:val="both"/>
+              <w:rPr>
+                <w:rFonts w:ascii="Poppins" w:hAnsi="Poppins" w:cs="Poppins"/>
+              </w:rPr>
+            </w:pPr>
+            <w:r>
+              <w:rPr>
+                <w:rFonts w:ascii="Poppins" w:hAnsi="Poppins" w:cs="Poppins"/>
+              </w:rPr>
+              <w:t> </w:t>
+            </w:r>
+            <w:r>
+              <w:rPr>
+                <w:rFonts w:ascii="Poppins" w:hAnsi="Poppins" w:cs="Poppins"/>
+              </w:rPr>
+              <w:t>GARNIER J.</w:t>
+            </w:r>
+          </w:p>
+        </w:tc>
+        <w:tc>
+          <w:tcPr>
+            <w:tcW w:w="3537" w:type="dxa"/>
+            <w:tcBorders>
+              <w:top w:val="single" w:sz="6" w:space="0" w:color="auto"/>
+              <w:left w:val="single" w:sz="6" w:space="0" w:color="auto"/>
+              <w:bottom w:val="single" w:sz="6" w:space="0" w:color="auto"/>
+              <w:right w:val="single" w:sz="6" w:space="0" w:color="auto"/>
+            </w:tcBorders>
+            <w:hideMark/>
+          </w:tcPr>
+          <w:p>
+            <w:pPr>
+              <w:jc w:val="both"/>
+              <w:rPr>
+                <w:rFonts w:ascii="Poppins" w:hAnsi="Poppins" w:cs="Poppins"/>
+              </w:rPr>
+            </w:pPr>
+            <w:r>
+              <w:rPr>
+                <w:rFonts w:ascii="Poppins" w:hAnsi="Poppins" w:cs="Poppins"/>
+              </w:rPr>
+              <w:t>Rédaction initiale du document </w:t>
+            </w:r>
+          </w:p>
+        </w:tc>
+      </w:tr>
+      <w:tr>
+        <w:trPr>
+          <w:trHeight w:val="300"/>
+        </w:trPr>
+        <w:tc>
+          <w:tcPr>
+            <w:tcW w:w="1050" w:type="dxa"/>
+            <w:tcBorders>
+              <w:top w:val="single" w:sz="6" w:space="0" w:color="auto"/>
+              <w:left w:val="single" w:sz="6" w:space="0" w:color="auto"/>
+              <w:bottom w:val="single" w:sz="6" w:space="0" w:color="auto"/>
+              <w:right w:val="single" w:sz="6" w:space="0" w:color="auto"/>
+            </w:tcBorders>
+          </w:tcPr>
+          <w:p>
+            <w:pPr>
+              <w:jc w:val="both"/>
+              <w:rPr>
+                <w:rFonts w:ascii="Poppins" w:hAnsi="Poppins" w:cs="Poppins"/>
+              </w:rPr>
+            </w:pPr>
+            <w:r>
+              <w:rPr>
+                <w:rFonts w:ascii="Poppins" w:hAnsi="Poppins" w:cs="Poppins"/>
+              </w:rPr>
+              <w:t>V2</w:t>
+            </w:r>
+          </w:p>
+        </w:tc>
+        <w:tc>
+          <w:tcPr>
+            <w:tcW w:w="1320" w:type="dxa"/>
+            <w:tcBorders>
+              <w:top w:val="single" w:sz="6" w:space="0" w:color="auto"/>
+              <w:left w:val="single" w:sz="6" w:space="0" w:color="auto"/>
+              <w:bottom w:val="single" w:sz="6" w:space="0" w:color="auto"/>
+              <w:right w:val="single" w:sz="6" w:space="0" w:color="auto"/>
+            </w:tcBorders>
+          </w:tcPr>
+          <w:p>
+            <w:pPr>
+              <w:jc w:val="both"/>
+              <w:rPr>
+                <w:rFonts w:ascii="Poppins" w:hAnsi="Poppins" w:cs="Poppins"/>
+              </w:rPr>
+            </w:pPr>
+            <w:r>
+              <w:rPr>
+                <w:rFonts w:ascii="Poppins" w:hAnsi="Poppins" w:cs="Poppins"/>
+              </w:rPr>
+              <w:t>22/02/2026</w:t>
+            </w:r>
+          </w:p>
+        </w:tc>
+        <w:tc>
+          <w:tcPr>
+            <w:tcW w:w="1575" w:type="dxa"/>
+            <w:tcBorders>
+              <w:top w:val="single" w:sz="6" w:space="0" w:color="auto"/>
+              <w:left w:val="single" w:sz="6" w:space="0" w:color="auto"/>
+              <w:bottom w:val="single" w:sz="6" w:space="0" w:color="auto"/>
+              <w:right w:val="single" w:sz="6" w:space="0" w:color="auto"/>
+            </w:tcBorders>
+          </w:tcPr>
+          <w:p>
+            <w:pPr>
+              <w:jc w:val="both"/>
+              <w:rPr>
+                <w:rFonts w:ascii="Poppins" w:hAnsi="Poppins" w:cs="Poppins"/>
+              </w:rPr>
+            </w:pPr>
+            <w:r>
+              <w:rPr>
+                <w:rFonts w:ascii="Poppins" w:hAnsi="Poppins" w:cs="Poppins"/>
+              </w:rPr>
+              <w:t>GARNIER J.</w:t>
+            </w:r>
+          </w:p>
+        </w:tc>
+        <w:tc>
+          <w:tcPr>
+            <w:tcW w:w="1574" w:type="dxa"/>
+            <w:tcBorders>
+              <w:top w:val="single" w:sz="6" w:space="0" w:color="auto"/>
+              <w:left w:val="single" w:sz="6" w:space="0" w:color="auto"/>
+              <w:bottom w:val="single" w:sz="6" w:space="0" w:color="auto"/>
+              <w:right w:val="single" w:sz="6" w:space="0" w:color="auto"/>
+            </w:tcBorders>
+          </w:tcPr>
+          <w:p>
+            <w:pPr>
+              <w:jc w:val="both"/>
+              <w:rPr>
+                <w:rFonts w:ascii="Poppins" w:hAnsi="Poppins" w:cs="Poppins"/>
+              </w:rPr>
+            </w:pPr>
+          </w:p>
+        </w:tc>
+        <w:tc>
+          <w:tcPr>
+            <w:tcW w:w="3537" w:type="dxa"/>
+            <w:tcBorders>
+              <w:top w:val="single" w:sz="6" w:space="0" w:color="auto"/>
+              <w:left w:val="single" w:sz="6" w:space="0" w:color="auto"/>
+              <w:bottom w:val="single" w:sz="6" w:space="0" w:color="auto"/>
+              <w:right w:val="single" w:sz="6" w:space="0" w:color="auto"/>
+            </w:tcBorders>
+          </w:tcPr>
+          <w:p>
+            <w:pPr>
+              <w:jc w:val="both"/>
+              <w:rPr>
+                <w:rFonts w:ascii="Poppins" w:hAnsi="Poppins" w:cs="Poppins"/>
+              </w:rPr>
+            </w:pPr>
+            <w:r>
+              <w:rPr>
+                <w:rFonts w:ascii="Poppins" w:hAnsi="Poppins" w:cs="Poppins"/>
+              </w:rPr>
+              <w:t>Ajout de quelques détails supplémentaires et mise en page améliorée</w:t>
+            </w:r>
+          </w:p>
+        </w:tc>
+      </w:tr>
+    </w:tbl>
+    <w:p>
+      <w:pPr>
+        <w:jc w:val="both"/>
+        <w:rPr>
+          <w:rFonts w:ascii="Poppins" w:hAnsi="Poppins" w:cs="Poppins"/>
+        </w:rPr>
+      </w:pPr>
+    </w:p>
     <w:sectPr>
+      <w:headerReference w:type="default" r:id="rId14"/>
+      <w:footerReference w:type="default" r:id="rId15"/>
       <w:pgSz w:w="11906" w:h="16838"/>
       <w:pgMar w:top="1417" w:right="1417" w:bottom="1417" w:left="1417" w:header="708" w:footer="708" w:gutter="0"/>
       <w:cols w:space="708"/>
@@ -871,12 +2088,176 @@
 </w:document>
 </file>
 
+<file path=word/endnotes.xml><?xml version="1.0" encoding="utf-8"?>
+<w:endnotes xmlns:wpc="http://schemas.microsoft.com/office/word/2010/wordprocessingCanvas" xmlns:cx="http://schemas.microsoft.com/office/drawing/2014/chartex" xmlns:cx1="http://schemas.microsoft.com/office/drawing/2015/9/8/chartex" xmlns:cx2="http://schemas.microsoft.com/office/drawing/2015/10/21/chartex" xmlns:cx3="http://schemas.microsoft.com/office/drawing/2016/5/9/chartex" xmlns:cx4="http://schemas.microsoft.com/office/drawing/2016/5/10/chartex" xmlns:cx5="http://schemas.microsoft.com/office/drawing/2016/5/11/chartex" xmlns:cx6="http://schemas.microsoft.com/office/drawing/2016/5/12/chartex" xmlns:cx7="http://schemas.microsoft.com/office/drawing/2016/5/13/chartex" xmlns:cx8="http://schemas.microsoft.com/office/drawing/2016/5/14/chartex" xmlns:mc="http://schemas.openxmlformats.org/markup-compatibility/2006" xmlns:aink="http://schemas.microsoft.com/office/drawing/2016/ink" xmlns:am3d="http://schemas.microsoft.com/office/drawing/2017/model3d" xmlns:o="urn:schemas-microsoft-com:office:office" xmlns:oel="http://schemas.microsoft.com/office/2019/extlst" xmlns:r="http://schemas.openxmlformats.org/officeDocument/2006/relationships" xmlns:m="http://schemas.openxmlformats.org/officeDocument/2006/math" xmlns:v="urn:schemas-microsoft-com:vml" xmlns:wp14="http://schemas.microsoft.com/office/word/2010/wordprocessingDrawing" xmlns:wp="http://schemas.openxmlformats.org/drawingml/2006/wordprocessingDrawing" xmlns:w10="urn:schemas-microsoft-com:office:word" xmlns:w="http://schemas.openxmlformats.org/wordprocessingml/2006/main" xmlns:w14="http://schemas.microsoft.com/office/word/2010/wordml" xmlns:w15="http://schemas.microsoft.com/office/word/2012/wordml" xmlns:w16cex="http://schemas.microsoft.com/office/word/2018/wordml/cex" xmlns:w16cid="http://schemas.microsoft.com/office/word/2016/wordml/cid" xmlns:w16="http://schemas.microsoft.com/office/word/2018/wordml" xmlns:w16du="http://schemas.microsoft.com/office/word/2023/wordml/word16du" xmlns:w16sdtdh="http://schemas.microsoft.com/office/word/2020/wordml/sdtdatahash" xmlns:w16sdtfl="http://schemas.microsoft.com/office/word/2024/wordml/sdtformatlock" xmlns:w16se="http://schemas.microsoft.com/office/word/2015/wordml/symex" xmlns:wpg="http://schemas.microsoft.com/office/word/2010/wordprocessingGroup" xmlns:wpi="http://schemas.microsoft.com/office/word/2010/wordprocessingInk" xmlns:wne="http://schemas.microsoft.com/office/word/2006/wordml" xmlns:wps="http://schemas.microsoft.com/office/word/2010/wordprocessingShape" mc:Ignorable="w14 w15 w16se w16cid w16 w16cex w16sdtdh w16sdtfl w16du wp14">
+  <w:endnote w:type="separator" w:id="-1">
+    <w:p>
+      <w:pPr>
+        <w:spacing w:after="0" w:line="240" w:lineRule="auto"/>
+      </w:pPr>
+      <w:r>
+        <w:separator/>
+      </w:r>
+    </w:p>
+  </w:endnote>
+  <w:endnote w:type="continuationSeparator" w:id="0">
+    <w:p>
+      <w:pPr>
+        <w:spacing w:after="0" w:line="240" w:lineRule="auto"/>
+      </w:pPr>
+      <w:r>
+        <w:continuationSeparator/>
+      </w:r>
+    </w:p>
+  </w:endnote>
+</w:endnotes>
+</file>
+
+<file path=word/footer1.xml><?xml version="1.0" encoding="utf-8"?>
+<w:ftr xmlns:wpc="http://schemas.microsoft.com/office/word/2010/wordprocessingCanvas" xmlns:cx="http://schemas.microsoft.com/office/drawing/2014/chartex" xmlns:cx1="http://schemas.microsoft.com/office/drawing/2015/9/8/chartex" xmlns:cx2="http://schemas.microsoft.com/office/drawing/2015/10/21/chartex" xmlns:cx3="http://schemas.microsoft.com/office/drawing/2016/5/9/chartex" xmlns:cx4="http://schemas.microsoft.com/office/drawing/2016/5/10/chartex" xmlns:cx5="http://schemas.microsoft.com/office/drawing/2016/5/11/chartex" xmlns:cx6="http://schemas.microsoft.com/office/drawing/2016/5/12/chartex" xmlns:cx7="http://schemas.microsoft.com/office/drawing/2016/5/13/chartex" xmlns:cx8="http://schemas.microsoft.com/office/drawing/2016/5/14/chartex" xmlns:mc="http://schemas.openxmlformats.org/markup-compatibility/2006" xmlns:aink="http://schemas.microsoft.com/office/drawing/2016/ink" xmlns:am3d="http://schemas.microsoft.com/office/drawing/2017/model3d" xmlns:o="urn:schemas-microsoft-com:office:office" xmlns:oel="http://schemas.microsoft.com/office/2019/extlst" xmlns:r="http://schemas.openxmlformats.org/officeDocument/2006/relationships" xmlns:m="http://schemas.openxmlformats.org/officeDocument/2006/math" xmlns:v="urn:schemas-microsoft-com:vml" xmlns:wp14="http://schemas.microsoft.com/office/word/2010/wordprocessingDrawing" xmlns:wp="http://schemas.openxmlformats.org/drawingml/2006/wordprocessingDrawing" xmlns:w10="urn:schemas-microsoft-com:office:word" xmlns:w="http://schemas.openxmlformats.org/wordprocessingml/2006/main" xmlns:w14="http://schemas.microsoft.com/office/word/2010/wordml" xmlns:w15="http://schemas.microsoft.com/office/word/2012/wordml" xmlns:w16cex="http://schemas.microsoft.com/office/word/2018/wordml/cex" xmlns:w16cid="http://schemas.microsoft.com/office/word/2016/wordml/cid" xmlns:w16="http://schemas.microsoft.com/office/word/2018/wordml" xmlns:w16du="http://schemas.microsoft.com/office/word/2023/wordml/word16du" xmlns:w16sdtdh="http://schemas.microsoft.com/office/word/2020/wordml/sdtdatahash" xmlns:w16sdtfl="http://schemas.microsoft.com/office/word/2024/wordml/sdtformatlock" xmlns:w16se="http://schemas.microsoft.com/office/word/2015/wordml/symex" xmlns:wpg="http://schemas.microsoft.com/office/word/2010/wordprocessingGroup" xmlns:wpi="http://schemas.microsoft.com/office/word/2010/wordprocessingInk" xmlns:wne="http://schemas.microsoft.com/office/word/2006/wordml" xmlns:wps="http://schemas.microsoft.com/office/word/2010/wordprocessingShape" mc:Ignorable="w14 w15 w16se w16cid w16 w16cex w16sdtdh w16sdtfl w16du wp14">
+  <w:sdt>
+    <w:sdtPr>
+      <w:id w:val="673924340"/>
+      <w:docPartObj>
+        <w:docPartGallery w:val="Page Numbers (Top of Page)"/>
+        <w:docPartUnique/>
+      </w:docPartObj>
+    </w:sdtPr>
+    <w:sdtContent>
+      <w:p>
+        <w:pPr>
+          <w:pStyle w:val="En-tte"/>
+          <w:jc w:val="center"/>
+        </w:pPr>
+        <w:r>
+          <w:t xml:space="preserve">Page </w:t>
+        </w:r>
+        <w:r>
+          <w:rPr>
+            <w:b/>
+            <w:bCs/>
+          </w:rPr>
+          <w:fldChar w:fldCharType="begin"/>
+        </w:r>
+        <w:r>
+          <w:rPr>
+            <w:b/>
+            <w:bCs/>
+          </w:rPr>
+          <w:instrText>PAGE</w:instrText>
+        </w:r>
+        <w:r>
+          <w:rPr>
+            <w:b/>
+            <w:bCs/>
+          </w:rPr>
+          <w:fldChar w:fldCharType="separate"/>
+        </w:r>
+        <w:r>
+          <w:rPr>
+            <w:b/>
+            <w:bCs/>
+          </w:rPr>
+          <w:t>1</w:t>
+        </w:r>
+        <w:r>
+          <w:rPr>
+            <w:b/>
+            <w:bCs/>
+          </w:rPr>
+          <w:fldChar w:fldCharType="end"/>
+        </w:r>
+        <w:r>
+          <w:t xml:space="preserve"> sur </w:t>
+        </w:r>
+        <w:r>
+          <w:rPr>
+            <w:b/>
+            <w:bCs/>
+          </w:rPr>
+          <w:fldChar w:fldCharType="begin"/>
+        </w:r>
+        <w:r>
+          <w:rPr>
+            <w:b/>
+            <w:bCs/>
+          </w:rPr>
+          <w:instrText>NUMPAGES</w:instrText>
+        </w:r>
+        <w:r>
+          <w:rPr>
+            <w:b/>
+            <w:bCs/>
+          </w:rPr>
+          <w:fldChar w:fldCharType="separate"/>
+        </w:r>
+        <w:r>
+          <w:rPr>
+            <w:b/>
+            <w:bCs/>
+          </w:rPr>
+          <w:t>3</w:t>
+        </w:r>
+        <w:r>
+          <w:rPr>
+            <w:b/>
+            <w:bCs/>
+          </w:rPr>
+          <w:fldChar w:fldCharType="end"/>
+        </w:r>
+      </w:p>
+    </w:sdtContent>
+  </w:sdt>
+</w:ftr>
+</file>
+
+<file path=word/footnotes.xml><?xml version="1.0" encoding="utf-8"?>
+<w:footnotes xmlns:wpc="http://schemas.microsoft.com/office/word/2010/wordprocessingCanvas" xmlns:cx="http://schemas.microsoft.com/office/drawing/2014/chartex" xmlns:cx1="http://schemas.microsoft.com/office/drawing/2015/9/8/chartex" xmlns:cx2="http://schemas.microsoft.com/office/drawing/2015/10/21/chartex" xmlns:cx3="http://schemas.microsoft.com/office/drawing/2016/5/9/chartex" xmlns:cx4="http://schemas.microsoft.com/office/drawing/2016/5/10/chartex" xmlns:cx5="http://schemas.microsoft.com/office/drawing/2016/5/11/chartex" xmlns:cx6="http://schemas.microsoft.com/office/drawing/2016/5/12/chartex" xmlns:cx7="http://schemas.microsoft.com/office/drawing/2016/5/13/chartex" xmlns:cx8="http://schemas.microsoft.com/office/drawing/2016/5/14/chartex" xmlns:mc="http://schemas.openxmlformats.org/markup-compatibility/2006" xmlns:aink="http://schemas.microsoft.com/office/drawing/2016/ink" xmlns:am3d="http://schemas.microsoft.com/office/drawing/2017/model3d" xmlns:o="urn:schemas-microsoft-com:office:office" xmlns:oel="http://schemas.microsoft.com/office/2019/extlst" xmlns:r="http://schemas.openxmlformats.org/officeDocument/2006/relationships" xmlns:m="http://schemas.openxmlformats.org/officeDocument/2006/math" xmlns:v="urn:schemas-microsoft-com:vml" xmlns:wp14="http://schemas.microsoft.com/office/word/2010/wordprocessingDrawing" xmlns:wp="http://schemas.openxmlformats.org/drawingml/2006/wordprocessingDrawing" xmlns:w10="urn:schemas-microsoft-com:office:word" xmlns:w="http://schemas.openxmlformats.org/wordprocessingml/2006/main" xmlns:w14="http://schemas.microsoft.com/office/word/2010/wordml" xmlns:w15="http://schemas.microsoft.com/office/word/2012/wordml" xmlns:w16cex="http://schemas.microsoft.com/office/word/2018/wordml/cex" xmlns:w16cid="http://schemas.microsoft.com/office/word/2016/wordml/cid" xmlns:w16="http://schemas.microsoft.com/office/word/2018/wordml" xmlns:w16du="http://schemas.microsoft.com/office/word/2023/wordml/word16du" xmlns:w16sdtdh="http://schemas.microsoft.com/office/word/2020/wordml/sdtdatahash" xmlns:w16sdtfl="http://schemas.microsoft.com/office/word/2024/wordml/sdtformatlock" xmlns:w16se="http://schemas.microsoft.com/office/word/2015/wordml/symex" xmlns:wpg="http://schemas.microsoft.com/office/word/2010/wordprocessingGroup" xmlns:wpi="http://schemas.microsoft.com/office/word/2010/wordprocessingInk" xmlns:wne="http://schemas.microsoft.com/office/word/2006/wordml" xmlns:wps="http://schemas.microsoft.com/office/word/2010/wordprocessingShape" mc:Ignorable="w14 w15 w16se w16cid w16 w16cex w16sdtdh w16sdtfl w16du wp14">
+  <w:footnote w:type="separator" w:id="-1">
+    <w:p>
+      <w:pPr>
+        <w:spacing w:after="0" w:line="240" w:lineRule="auto"/>
+      </w:pPr>
+      <w:r>
+        <w:separator/>
+      </w:r>
+    </w:p>
+  </w:footnote>
+  <w:footnote w:type="continuationSeparator" w:id="0">
+    <w:p>
+      <w:pPr>
+        <w:spacing w:after="0" w:line="240" w:lineRule="auto"/>
+      </w:pPr>
+      <w:r>
+        <w:continuationSeparator/>
+      </w:r>
+    </w:p>
+  </w:footnote>
+</w:footnotes>
+</file>
+
+<file path=word/header1.xml><?xml version="1.0" encoding="utf-8"?>
+<w:hdr xmlns:wpc="http://schemas.microsoft.com/office/word/2010/wordprocessingCanvas" xmlns:cx="http://schemas.microsoft.com/office/drawing/2014/chartex" xmlns:cx1="http://schemas.microsoft.com/office/drawing/2015/9/8/chartex" xmlns:cx2="http://schemas.microsoft.com/office/drawing/2015/10/21/chartex" xmlns:cx3="http://schemas.microsoft.com/office/drawing/2016/5/9/chartex" xmlns:cx4="http://schemas.microsoft.com/office/drawing/2016/5/10/chartex" xmlns:cx5="http://schemas.microsoft.com/office/drawing/2016/5/11/chartex" xmlns:cx6="http://schemas.microsoft.com/office/drawing/2016/5/12/chartex" xmlns:cx7="http://schemas.microsoft.com/office/drawing/2016/5/13/chartex" xmlns:cx8="http://schemas.microsoft.com/office/drawing/2016/5/14/chartex" xmlns:mc="http://schemas.openxmlformats.org/markup-compatibility/2006" xmlns:aink="http://schemas.microsoft.com/office/drawing/2016/ink" xmlns:am3d="http://schemas.microsoft.com/office/drawing/2017/model3d" xmlns:o="urn:schemas-microsoft-com:office:office" xmlns:oel="http://schemas.microsoft.com/office/2019/extlst" xmlns:r="http://schemas.openxmlformats.org/officeDocument/2006/relationships" xmlns:m="http://schemas.openxmlformats.org/officeDocument/2006/math" xmlns:v="urn:schemas-microsoft-com:vml" xmlns:wp14="http://schemas.microsoft.com/office/word/2010/wordprocessingDrawing" xmlns:wp="http://schemas.openxmlformats.org/drawingml/2006/wordprocessingDrawing" xmlns:w10="urn:schemas-microsoft-com:office:word" xmlns:w="http://schemas.openxmlformats.org/wordprocessingml/2006/main" xmlns:w14="http://schemas.microsoft.com/office/word/2010/wordml" xmlns:w15="http://schemas.microsoft.com/office/word/2012/wordml" xmlns:w16cex="http://schemas.microsoft.com/office/word/2018/wordml/cex" xmlns:w16cid="http://schemas.microsoft.com/office/word/2016/wordml/cid" xmlns:w16="http://schemas.microsoft.com/office/word/2018/wordml" xmlns:w16du="http://schemas.microsoft.com/office/word/2023/wordml/word16du" xmlns:w16sdtdh="http://schemas.microsoft.com/office/word/2020/wordml/sdtdatahash" xmlns:w16sdtfl="http://schemas.microsoft.com/office/word/2024/wordml/sdtformatlock" xmlns:w16se="http://schemas.microsoft.com/office/word/2015/wordml/symex" xmlns:wpg="http://schemas.microsoft.com/office/word/2010/wordprocessingGroup" xmlns:wpi="http://schemas.microsoft.com/office/word/2010/wordprocessingInk" xmlns:wne="http://schemas.microsoft.com/office/word/2006/wordml" xmlns:wps="http://schemas.microsoft.com/office/word/2010/wordprocessingShape" mc:Ignorable="w14 w15 w16se w16cid w16 w16cex w16sdtdh w16sdtfl w16du wp14">
+  <w:p>
+    <w:pPr>
+      <w:pStyle w:val="En-tte"/>
+      <w:jc w:val="center"/>
+    </w:pPr>
+  </w:p>
+  <w:p>
+    <w:pPr>
+      <w:pStyle w:val="En-tte"/>
+    </w:pPr>
+  </w:p>
+</w:hdr>
+</file>
+
 <file path=word/numbering.xml><?xml version="1.0" encoding="utf-8"?>
 <w:numbering xmlns:wpc="http://schemas.microsoft.com/office/word/2010/wordprocessingCanvas" xmlns:cx="http://schemas.microsoft.com/office/drawing/2014/chartex" xmlns:cx1="http://schemas.microsoft.com/office/drawing/2015/9/8/chartex" xmlns:cx2="http://schemas.microsoft.com/office/drawing/2015/10/21/chartex" xmlns:cx3="http://schemas.microsoft.com/office/drawing/2016/5/9/chartex" xmlns:cx4="http://schemas.microsoft.com/office/drawing/2016/5/10/chartex" xmlns:cx5="http://schemas.microsoft.com/office/drawing/2016/5/11/chartex" xmlns:cx6="http://schemas.microsoft.com/office/drawing/2016/5/12/chartex" xmlns:cx7="http://schemas.microsoft.com/office/drawing/2016/5/13/chartex" xmlns:cx8="http://schemas.microsoft.com/office/drawing/2016/5/14/chartex" xmlns:mc="http://schemas.openxmlformats.org/markup-compatibility/2006" xmlns:aink="http://schemas.microsoft.com/office/drawing/2016/ink" xmlns:am3d="http://schemas.microsoft.com/office/drawing/2017/model3d" xmlns:o="urn:schemas-microsoft-com:office:office" xmlns:oel="http://schemas.microsoft.com/office/2019/extlst" xmlns:r="http://schemas.openxmlformats.org/officeDocument/2006/relationships" xmlns:m="http://schemas.openxmlformats.org/officeDocument/2006/math" xmlns:v="urn:schemas-microsoft-com:vml" xmlns:wp14="http://schemas.microsoft.com/office/word/2010/wordprocessingDrawing" xmlns:wp="http://schemas.openxmlformats.org/drawingml/2006/wordprocessingDrawing" xmlns:w10="urn:schemas-microsoft-com:office:word" xmlns:w="http://schemas.openxmlformats.org/wordprocessingml/2006/main" xmlns:w14="http://schemas.microsoft.com/office/word/2010/wordml" xmlns:w15="http://schemas.microsoft.com/office/word/2012/wordml" xmlns:w16cex="http://schemas.microsoft.com/office/word/2018/wordml/cex" xmlns:w16cid="http://schemas.microsoft.com/office/word/2016/wordml/cid" xmlns:w16="http://schemas.microsoft.com/office/word/2018/wordml" xmlns:w16du="http://schemas.microsoft.com/office/word/2023/wordml/word16du" xmlns:w16sdtdh="http://schemas.microsoft.com/office/word/2020/wordml/sdtdatahash" xmlns:w16sdtfl="http://schemas.microsoft.com/office/word/2024/wordml/sdtformatlock" xmlns:w16se="http://schemas.microsoft.com/office/word/2015/wordml/symex" xmlns:wpg="http://schemas.microsoft.com/office/word/2010/wordprocessingGroup" xmlns:wpi="http://schemas.microsoft.com/office/word/2010/wordprocessingInk" xmlns:wne="http://schemas.microsoft.com/office/word/2006/wordml" xmlns:wps="http://schemas.microsoft.com/office/word/2010/wordprocessingShape" mc:Ignorable="w14 w15 w16se w16cid w16 w16cex w16sdtdh w16sdtfl w16du wp14">
   <w:abstractNum w:abstractNumId="0" w15:restartNumberingAfterBreak="0">
     <w:nsid w:val="08F85444"/>
     <w:multiLevelType w:val="hybridMultilevel"/>
-    <w:tmpl w:val="6AD4E8D2"/>
+    <w:tmpl w:val="F27AF51E"/>
     <w:lvl w:ilvl="0" w:tplc="34843428">
       <w:numFmt w:val="bullet"/>
       <w:lvlText w:val=""/>
@@ -1622,7 +3003,10 @@
   <w:style w:type="paragraph" w:default="1" w:styleId="Normal">
     <w:name w:val="Normal"/>
     <w:qFormat/>
-    <w:rsid w:val="006D32EE"/>
+    <w:rsid w:val="004B362E"/>
+    <w:rPr>
+      <w:color w:val="112250"/>
+    </w:rPr>
   </w:style>
   <w:style w:type="paragraph" w:styleId="Titre1">
     <w:name w:val="heading 1"/>
@@ -1631,7 +3015,7 @@
     <w:link w:val="Titre1Car"/>
     <w:uiPriority w:val="9"/>
     <w:qFormat/>
-    <w:rsid w:val="00B91DBA"/>
+    <w:rsid w:val="008266B0"/>
     <w:pPr>
       <w:keepNext/>
       <w:keepLines/>
@@ -1640,7 +3024,7 @@
     </w:pPr>
     <w:rPr>
       <w:rFonts w:asciiTheme="majorHAnsi" w:eastAsiaTheme="majorEastAsia" w:hAnsiTheme="majorHAnsi" w:cstheme="majorBidi"/>
-      <w:color w:val="0F4761" w:themeColor="accent1" w:themeShade="BF"/>
+      <w:b/>
       <w:sz w:val="40"/>
       <w:szCs w:val="40"/>
     </w:rPr>
@@ -1653,7 +3037,7 @@
     <w:uiPriority w:val="9"/>
     <w:unhideWhenUsed/>
     <w:qFormat/>
-    <w:rsid w:val="00B91DBA"/>
+    <w:rsid w:val="004B362E"/>
     <w:pPr>
       <w:keepNext/>
       <w:keepLines/>
@@ -1662,9 +3046,9 @@
     </w:pPr>
     <w:rPr>
       <w:rFonts w:asciiTheme="majorHAnsi" w:eastAsiaTheme="majorEastAsia" w:hAnsiTheme="majorHAnsi" w:cstheme="majorBidi"/>
-      <w:color w:val="0F4761" w:themeColor="accent1" w:themeShade="BF"/>
       <w:sz w:val="32"/>
       <w:szCs w:val="32"/>
+      <w:u w:val="single"/>
     </w:rPr>
   </w:style>
   <w:style w:type="paragraph" w:styleId="Titre3">
@@ -1853,10 +3237,11 @@
     <w:basedOn w:val="Policepardfaut"/>
     <w:link w:val="Titre1"/>
     <w:uiPriority w:val="9"/>
-    <w:rsid w:val="00B91DBA"/>
+    <w:rsid w:val="008266B0"/>
     <w:rPr>
       <w:rFonts w:asciiTheme="majorHAnsi" w:eastAsiaTheme="majorEastAsia" w:hAnsiTheme="majorHAnsi" w:cstheme="majorBidi"/>
-      <w:color w:val="0F4761" w:themeColor="accent1" w:themeShade="BF"/>
+      <w:b/>
+      <w:color w:val="112250"/>
       <w:sz w:val="40"/>
       <w:szCs w:val="40"/>
     </w:rPr>
@@ -1866,12 +3251,13 @@
     <w:basedOn w:val="Policepardfaut"/>
     <w:link w:val="Titre2"/>
     <w:uiPriority w:val="9"/>
-    <w:rsid w:val="00B91DBA"/>
+    <w:rsid w:val="004B362E"/>
     <w:rPr>
       <w:rFonts w:asciiTheme="majorHAnsi" w:eastAsiaTheme="majorEastAsia" w:hAnsiTheme="majorHAnsi" w:cstheme="majorBidi"/>
-      <w:color w:val="0F4761" w:themeColor="accent1" w:themeShade="BF"/>
+      <w:color w:val="112250"/>
       <w:sz w:val="32"/>
       <w:szCs w:val="32"/>
+      <w:u w:val="single"/>
     </w:rPr>
   </w:style>
   <w:style w:type="character" w:customStyle="1" w:styleId="Titre3Car">
@@ -2165,6 +3551,108 @@
       <w:rFonts w:ascii="Consolas" w:hAnsi="Consolas"/>
       <w:sz w:val="20"/>
       <w:szCs w:val="20"/>
+    </w:rPr>
+  </w:style>
+  <w:style w:type="paragraph" w:styleId="En-tte">
+    <w:name w:val="header"/>
+    <w:basedOn w:val="Normal"/>
+    <w:link w:val="En-tteCar"/>
+    <w:uiPriority w:val="99"/>
+    <w:unhideWhenUsed/>
+    <w:rsid w:val="00B80649"/>
+    <w:pPr>
+      <w:tabs>
+        <w:tab w:val="center" w:pos="4536"/>
+        <w:tab w:val="right" w:pos="9072"/>
+      </w:tabs>
+      <w:spacing w:after="0" w:line="240" w:lineRule="auto"/>
+    </w:pPr>
+  </w:style>
+  <w:style w:type="character" w:customStyle="1" w:styleId="En-tteCar">
+    <w:name w:val="En-tête Car"/>
+    <w:basedOn w:val="Policepardfaut"/>
+    <w:link w:val="En-tte"/>
+    <w:uiPriority w:val="99"/>
+    <w:rsid w:val="00B80649"/>
+  </w:style>
+  <w:style w:type="paragraph" w:styleId="Pieddepage">
+    <w:name w:val="footer"/>
+    <w:basedOn w:val="Normal"/>
+    <w:link w:val="PieddepageCar"/>
+    <w:uiPriority w:val="99"/>
+    <w:unhideWhenUsed/>
+    <w:rsid w:val="00B80649"/>
+    <w:pPr>
+      <w:tabs>
+        <w:tab w:val="center" w:pos="4536"/>
+        <w:tab w:val="right" w:pos="9072"/>
+      </w:tabs>
+      <w:spacing w:after="0" w:line="240" w:lineRule="auto"/>
+    </w:pPr>
+  </w:style>
+  <w:style w:type="character" w:customStyle="1" w:styleId="PieddepageCar">
+    <w:name w:val="Pied de page Car"/>
+    <w:basedOn w:val="Policepardfaut"/>
+    <w:link w:val="Pieddepage"/>
+    <w:uiPriority w:val="99"/>
+    <w:rsid w:val="00B80649"/>
+  </w:style>
+  <w:style w:type="paragraph" w:styleId="En-ttedetabledesmatires">
+    <w:name w:val="TOC Heading"/>
+    <w:basedOn w:val="Titre1"/>
+    <w:next w:val="Normal"/>
+    <w:uiPriority w:val="39"/>
+    <w:unhideWhenUsed/>
+    <w:qFormat/>
+    <w:rsid w:val="000B3EB2"/>
+    <w:pPr>
+      <w:spacing w:before="240" w:after="0" w:line="259" w:lineRule="auto"/>
+      <w:outlineLvl w:val="9"/>
+    </w:pPr>
+    <w:rPr>
+      <w:b w:val="0"/>
+      <w:color w:val="0F4761" w:themeColor="accent1" w:themeShade="BF"/>
+      <w:kern w:val="0"/>
+      <w:sz w:val="32"/>
+      <w:szCs w:val="32"/>
+      <w:lang w:eastAsia="fr-FR"/>
+      <w14:ligatures w14:val="none"/>
+    </w:rPr>
+  </w:style>
+  <w:style w:type="paragraph" w:styleId="TM1">
+    <w:name w:val="toc 1"/>
+    <w:basedOn w:val="Normal"/>
+    <w:next w:val="Normal"/>
+    <w:autoRedefine/>
+    <w:uiPriority w:val="39"/>
+    <w:unhideWhenUsed/>
+    <w:rsid w:val="000B3EB2"/>
+    <w:pPr>
+      <w:spacing w:after="100"/>
+    </w:pPr>
+  </w:style>
+  <w:style w:type="paragraph" w:styleId="TM2">
+    <w:name w:val="toc 2"/>
+    <w:basedOn w:val="Normal"/>
+    <w:next w:val="Normal"/>
+    <w:autoRedefine/>
+    <w:uiPriority w:val="39"/>
+    <w:unhideWhenUsed/>
+    <w:rsid w:val="000B3EB2"/>
+    <w:pPr>
+      <w:spacing w:after="100"/>
+      <w:ind w:left="240"/>
+    </w:pPr>
+  </w:style>
+  <w:style w:type="character" w:styleId="Lienhypertexte">
+    <w:name w:val="Hyperlink"/>
+    <w:basedOn w:val="Policepardfaut"/>
+    <w:uiPriority w:val="99"/>
+    <w:unhideWhenUsed/>
+    <w:rsid w:val="000B3EB2"/>
+    <w:rPr>
+      <w:color w:val="467886" w:themeColor="hyperlink"/>
+      <w:u w:val="single"/>
     </w:rPr>
   </w:style>
 </w:styles>
@@ -2483,4 +3971,16 @@
     </a:ext>
   </a:extLst>
 </a:theme>
+</file>
+
+<file path=customXml/item1.xml><?xml version="1.0" encoding="utf-8"?>
+<b:Sources xmlns:b="http://schemas.openxmlformats.org/officeDocument/2006/bibliography" xmlns="http://schemas.openxmlformats.org/officeDocument/2006/bibliography" SelectedStyle="\APASixthEditionOfficeOnline.xsl" StyleName="APA" Version="6"/>
+</file>
+
+<file path=customXml/itemProps1.xml><?xml version="1.0" encoding="utf-8"?>
+<ds:datastoreItem xmlns:ds="http://schemas.openxmlformats.org/officeDocument/2006/customXml" ds:itemID="{895732C2-EC7D-4B6A-9393-90E2CF07870D}">
+  <ds:schemaRefs>
+    <ds:schemaRef ds:uri="http://schemas.openxmlformats.org/officeDocument/2006/bibliography"/>
+  </ds:schemaRefs>
+</ds:datastoreItem>
 </file>
</xml_diff>

<commit_message>
Ajout de toutes les procédures (2/2) - manque quelques phrases d'indications qui seront mis en place lors de la vérification et des tests
</commit_message>
<xml_diff>
--- a/Documents/Procedure/Procedure_Annonce_Invalide_Taille_Image.docx
+++ b/Documents/Procedure/Procedure_Annonce_Invalide_Taille_Image.docx
@@ -5,7 +5,7 @@
   <w:body>
     <w:p>
       <w:pPr>
-        <w:jc w:val="both"/>
+        <w:jc w:val="center"/>
         <w:rPr>
           <w:rFonts w:ascii="Poppins" w:hAnsi="Poppins" w:cs="Poppins"/>
           <w:b/>
@@ -19,6 +19,7 @@
           <w:rFonts w:ascii="Poppins" w:hAnsi="Poppins" w:cs="Poppins"/>
           <w:b/>
           <w:bCs/>
+          <w:noProof/>
           <w:sz w:val="44"/>
           <w:szCs w:val="44"/>
         </w:rPr>
@@ -159,7 +160,13 @@
     <w:sdt>
       <w:sdtPr>
         <w:rPr>
-          <w:rFonts w:ascii="Poppins" w:hAnsi="Poppins" w:cs="Poppins"/>
+          <w:rFonts w:ascii="Poppins" w:eastAsiaTheme="minorHAnsi" w:hAnsi="Poppins" w:cs="Poppins"/>
+          <w:color w:val="112250"/>
+          <w:kern w:val="2"/>
+          <w:sz w:val="24"/>
+          <w:szCs w:val="24"/>
+          <w:lang w:eastAsia="en-US"/>
+          <w14:ligatures w14:val="standardContextual"/>
         </w:rPr>
         <w:id w:val="-811020469"/>
         <w:docPartObj>
@@ -169,15 +176,8 @@
       </w:sdtPr>
       <w:sdtEndPr>
         <w:rPr>
-          <w:rFonts w:eastAsiaTheme="minorHAnsi"/>
-          <w:b/>
-          <w:bCs/>
-          <w:color w:val="112250"/>
-          <w:kern w:val="2"/>
-          <w:sz w:val="24"/>
-          <w:szCs w:val="24"/>
-          <w:lang w:eastAsia="en-US"/>
-          <w14:ligatures w14:val="standardContextual"/>
+          <w:b/>
+          <w:bCs/>
         </w:rPr>
       </w:sdtEndPr>
       <w:sdtContent>
@@ -208,8 +208,9 @@
             <w:tabs>
               <w:tab w:val="right" w:leader="dot" w:pos="9062"/>
             </w:tabs>
+            <w:jc w:val="both"/>
             <w:rPr>
-              <w:rFonts w:eastAsiaTheme="minorEastAsia"/>
+              <w:rFonts w:ascii="Poppins" w:eastAsiaTheme="minorEastAsia" w:hAnsi="Poppins" w:cs="Poppins"/>
               <w:noProof/>
               <w:color w:val="auto"/>
               <w:lang w:eastAsia="fr-FR"/>
@@ -244,6 +245,7 @@
             </w:r>
             <w:r>
               <w:rPr>
+                <w:rFonts w:ascii="Poppins" w:hAnsi="Poppins" w:cs="Poppins"/>
                 <w:noProof/>
                 <w:webHidden/>
               </w:rPr>
@@ -251,6 +253,7 @@
             </w:r>
             <w:r>
               <w:rPr>
+                <w:rFonts w:ascii="Poppins" w:hAnsi="Poppins" w:cs="Poppins"/>
                 <w:noProof/>
                 <w:webHidden/>
               </w:rPr>
@@ -258,6 +261,7 @@
             </w:r>
             <w:r>
               <w:rPr>
+                <w:rFonts w:ascii="Poppins" w:hAnsi="Poppins" w:cs="Poppins"/>
                 <w:noProof/>
                 <w:webHidden/>
               </w:rPr>
@@ -265,12 +269,14 @@
             </w:r>
             <w:r>
               <w:rPr>
+                <w:rFonts w:ascii="Poppins" w:hAnsi="Poppins" w:cs="Poppins"/>
                 <w:noProof/>
                 <w:webHidden/>
               </w:rPr>
             </w:r>
             <w:r>
               <w:rPr>
+                <w:rFonts w:ascii="Poppins" w:hAnsi="Poppins" w:cs="Poppins"/>
                 <w:noProof/>
                 <w:webHidden/>
               </w:rPr>
@@ -278,6 +284,7 @@
             </w:r>
             <w:r>
               <w:rPr>
+                <w:rFonts w:ascii="Poppins" w:hAnsi="Poppins" w:cs="Poppins"/>
                 <w:noProof/>
                 <w:webHidden/>
               </w:rPr>
@@ -285,6 +292,7 @@
             </w:r>
             <w:r>
               <w:rPr>
+                <w:rFonts w:ascii="Poppins" w:hAnsi="Poppins" w:cs="Poppins"/>
                 <w:noProof/>
                 <w:webHidden/>
               </w:rPr>
@@ -298,8 +306,9 @@
             <w:tabs>
               <w:tab w:val="right" w:leader="dot" w:pos="9062"/>
             </w:tabs>
+            <w:jc w:val="both"/>
             <w:rPr>
-              <w:rFonts w:eastAsiaTheme="minorEastAsia"/>
+              <w:rFonts w:ascii="Poppins" w:eastAsiaTheme="minorEastAsia" w:hAnsi="Poppins" w:cs="Poppins"/>
               <w:noProof/>
               <w:color w:val="auto"/>
               <w:lang w:eastAsia="fr-FR"/>
@@ -316,6 +325,7 @@
             </w:r>
             <w:r>
               <w:rPr>
+                <w:rFonts w:ascii="Poppins" w:hAnsi="Poppins" w:cs="Poppins"/>
                 <w:noProof/>
                 <w:webHidden/>
               </w:rPr>
@@ -323,6 +333,7 @@
             </w:r>
             <w:r>
               <w:rPr>
+                <w:rFonts w:ascii="Poppins" w:hAnsi="Poppins" w:cs="Poppins"/>
                 <w:noProof/>
                 <w:webHidden/>
               </w:rPr>
@@ -330,6 +341,7 @@
             </w:r>
             <w:r>
               <w:rPr>
+                <w:rFonts w:ascii="Poppins" w:hAnsi="Poppins" w:cs="Poppins"/>
                 <w:noProof/>
                 <w:webHidden/>
               </w:rPr>
@@ -337,12 +349,14 @@
             </w:r>
             <w:r>
               <w:rPr>
+                <w:rFonts w:ascii="Poppins" w:hAnsi="Poppins" w:cs="Poppins"/>
                 <w:noProof/>
                 <w:webHidden/>
               </w:rPr>
             </w:r>
             <w:r>
               <w:rPr>
+                <w:rFonts w:ascii="Poppins" w:hAnsi="Poppins" w:cs="Poppins"/>
                 <w:noProof/>
                 <w:webHidden/>
               </w:rPr>
@@ -350,6 +364,7 @@
             </w:r>
             <w:r>
               <w:rPr>
+                <w:rFonts w:ascii="Poppins" w:hAnsi="Poppins" w:cs="Poppins"/>
                 <w:noProof/>
                 <w:webHidden/>
               </w:rPr>
@@ -357,6 +372,7 @@
             </w:r>
             <w:r>
               <w:rPr>
+                <w:rFonts w:ascii="Poppins" w:hAnsi="Poppins" w:cs="Poppins"/>
                 <w:noProof/>
                 <w:webHidden/>
               </w:rPr>
@@ -793,6 +809,7 @@
     </w:p>
     <w:p>
       <w:pPr>
+        <w:jc w:val="both"/>
         <w:rPr>
           <w:rFonts w:ascii="Poppins" w:hAnsi="Poppins" w:cs="Poppins"/>
         </w:rPr>
@@ -978,14 +995,15 @@
     </w:p>
     <w:p>
       <w:pPr>
-        <w:jc w:val="center"/>
-        <w:rPr>
-          <w:rFonts w:ascii="Poppins" w:hAnsi="Poppins" w:cs="Poppins"/>
-        </w:rPr>
-      </w:pPr>
-      <w:r>
-        <w:rPr>
-          <w:rFonts w:ascii="Poppins" w:hAnsi="Poppins" w:cs="Poppins"/>
+        <w:jc w:val="both"/>
+        <w:rPr>
+          <w:rFonts w:ascii="Poppins" w:hAnsi="Poppins" w:cs="Poppins"/>
+        </w:rPr>
+      </w:pPr>
+      <w:r>
+        <w:rPr>
+          <w:rFonts w:ascii="Poppins" w:hAnsi="Poppins" w:cs="Poppins"/>
+          <w:noProof/>
         </w:rPr>
         <w:drawing>
           <wp:inline distT="0" distB="0" distL="0" distR="0" wp14:anchorId="3D6299DB" wp14:editId="74CADBB3">
@@ -1084,13 +1102,31 @@
           <w:b/>
           <w:bCs/>
         </w:rPr>
-        <w:t xml:space="preserve"> sur le logo wamp </w:t>
+        <w:t xml:space="preserve"> sur le logo </w:t>
+      </w:r>
+      <w:proofErr w:type="spellStart"/>
+      <w:r>
+        <w:rPr>
+          <w:rFonts w:ascii="Poppins" w:hAnsi="Poppins" w:cs="Poppins"/>
+          <w:b/>
+          <w:bCs/>
+        </w:rPr>
+        <w:t>wamp</w:t>
+      </w:r>
+      <w:proofErr w:type="spellEnd"/>
+      <w:r>
+        <w:rPr>
+          <w:rFonts w:ascii="Poppins" w:hAnsi="Poppins" w:cs="Poppins"/>
+          <w:b/>
+          <w:bCs/>
+        </w:rPr>
+        <w:t xml:space="preserve"> </w:t>
       </w:r>
     </w:p>
     <w:p>
       <w:pPr>
         <w:ind w:left="360"/>
-        <w:jc w:val="center"/>
+        <w:jc w:val="both"/>
         <w:rPr>
           <w:rFonts w:ascii="Poppins" w:hAnsi="Poppins" w:cs="Poppins"/>
           <w:b/>
@@ -1159,6 +1195,7 @@
           <w:bCs/>
         </w:rPr>
       </w:pPr>
+      <w:proofErr w:type="spellStart"/>
       <w:r>
         <w:rPr>
           <w:rFonts w:ascii="Poppins" w:hAnsi="Poppins" w:cs="Poppins"/>
@@ -1167,6 +1204,7 @@
         </w:rPr>
         <w:t>Php</w:t>
       </w:r>
+      <w:proofErr w:type="spellEnd"/>
       <w:r>
         <w:rPr>
           <w:rFonts w:ascii="Poppins" w:hAnsi="Poppins" w:cs="Poppins"/>
@@ -1179,7 +1217,7 @@
     </w:p>
     <w:p>
       <w:pPr>
-        <w:jc w:val="center"/>
+        <w:jc w:val="both"/>
         <w:rPr>
           <w:rFonts w:ascii="Poppins" w:hAnsi="Poppins" w:cs="Poppins"/>
         </w:rPr>
@@ -1257,7 +1295,7 @@
     </w:p>
     <w:p>
       <w:pPr>
-        <w:jc w:val="center"/>
+        <w:jc w:val="both"/>
         <w:rPr>
           <w:rFonts w:ascii="Poppins" w:hAnsi="Poppins" w:cs="Poppins"/>
         </w:rPr>
@@ -1331,7 +1369,43 @@
           <w:b/>
           <w:bCs/>
         </w:rPr>
-        <w:t>Une fois dans php .ini effectuée un CTRL + F et rechercher :</w:t>
+        <w:t xml:space="preserve">Une fois dans </w:t>
+      </w:r>
+      <w:proofErr w:type="spellStart"/>
+      <w:r>
+        <w:rPr>
+          <w:rFonts w:ascii="Poppins" w:hAnsi="Poppins" w:cs="Poppins"/>
+          <w:b/>
+          <w:bCs/>
+        </w:rPr>
+        <w:t>php</w:t>
+      </w:r>
+      <w:proofErr w:type="spellEnd"/>
+      <w:r>
+        <w:rPr>
+          <w:rFonts w:ascii="Poppins" w:hAnsi="Poppins" w:cs="Poppins"/>
+          <w:b/>
+          <w:bCs/>
+        </w:rPr>
+        <w:t> .</w:t>
+      </w:r>
+      <w:proofErr w:type="spellStart"/>
+      <w:r>
+        <w:rPr>
+          <w:rFonts w:ascii="Poppins" w:hAnsi="Poppins" w:cs="Poppins"/>
+          <w:b/>
+          <w:bCs/>
+        </w:rPr>
+        <w:t>ini</w:t>
+      </w:r>
+      <w:proofErr w:type="spellEnd"/>
+      <w:r>
+        <w:rPr>
+          <w:rFonts w:ascii="Poppins" w:hAnsi="Poppins" w:cs="Poppins"/>
+          <w:b/>
+          <w:bCs/>
+        </w:rPr>
+        <w:t xml:space="preserve"> effectuée un CTRL + F et rechercher :</w:t>
       </w:r>
     </w:p>
     <w:p>
@@ -1348,14 +1422,26 @@
           <w:bCs/>
         </w:rPr>
       </w:pPr>
-      <w:r>
-        <w:rPr>
-          <w:rFonts w:ascii="Poppins" w:hAnsi="Poppins" w:cs="Poppins"/>
-          <w:b/>
-          <w:bCs/>
-        </w:rPr>
-        <w:t>upload_max_filesize</w:t>
-      </w:r>
+      <w:proofErr w:type="spellStart"/>
+      <w:proofErr w:type="gramStart"/>
+      <w:r>
+        <w:rPr>
+          <w:rFonts w:ascii="Poppins" w:hAnsi="Poppins" w:cs="Poppins"/>
+          <w:b/>
+          <w:bCs/>
+        </w:rPr>
+        <w:t>upload</w:t>
+      </w:r>
+      <w:proofErr w:type="gramEnd"/>
+      <w:r>
+        <w:rPr>
+          <w:rFonts w:ascii="Poppins" w:hAnsi="Poppins" w:cs="Poppins"/>
+          <w:b/>
+          <w:bCs/>
+        </w:rPr>
+        <w:t>_max_filesize</w:t>
+      </w:r>
+      <w:proofErr w:type="spellEnd"/>
     </w:p>
     <w:p>
       <w:pPr>
@@ -1371,14 +1457,26 @@
           <w:bCs/>
         </w:rPr>
       </w:pPr>
-      <w:r>
-        <w:rPr>
-          <w:rFonts w:ascii="Poppins" w:hAnsi="Poppins" w:cs="Poppins"/>
-          <w:b/>
-          <w:bCs/>
-        </w:rPr>
-        <w:t>post_max_size</w:t>
-      </w:r>
+      <w:proofErr w:type="spellStart"/>
+      <w:proofErr w:type="gramStart"/>
+      <w:r>
+        <w:rPr>
+          <w:rFonts w:ascii="Poppins" w:hAnsi="Poppins" w:cs="Poppins"/>
+          <w:b/>
+          <w:bCs/>
+        </w:rPr>
+        <w:t>post</w:t>
+      </w:r>
+      <w:proofErr w:type="gramEnd"/>
+      <w:r>
+        <w:rPr>
+          <w:rFonts w:ascii="Poppins" w:hAnsi="Poppins" w:cs="Poppins"/>
+          <w:b/>
+          <w:bCs/>
+        </w:rPr>
+        <w:t>_max_size</w:t>
+      </w:r>
+      <w:proofErr w:type="spellEnd"/>
     </w:p>
     <w:p>
       <w:pPr>
@@ -1458,6 +1556,7 @@
         </w:rPr>
         <w:t xml:space="preserve">Exemple pour </w:t>
       </w:r>
+      <w:proofErr w:type="spellStart"/>
       <w:r>
         <w:rPr>
           <w:rFonts w:ascii="Poppins" w:hAnsi="Poppins" w:cs="Poppins"/>
@@ -1466,6 +1565,7 @@
         </w:rPr>
         <w:t>upload_max_filesize</w:t>
       </w:r>
+      <w:proofErr w:type="spellEnd"/>
       <w:r>
         <w:rPr>
           <w:rFonts w:ascii="Poppins" w:hAnsi="Poppins" w:cs="Poppins"/>
@@ -1487,13 +1587,33 @@
           <w:bCs/>
         </w:rPr>
       </w:pPr>
-      <w:r>
-        <w:rPr>
-          <w:rFonts w:ascii="Poppins" w:hAnsi="Poppins" w:cs="Poppins"/>
-          <w:b/>
-          <w:bCs/>
-        </w:rPr>
-        <w:t>upload_max_filesize = 10M</w:t>
+      <w:proofErr w:type="spellStart"/>
+      <w:proofErr w:type="gramStart"/>
+      <w:r>
+        <w:rPr>
+          <w:rFonts w:ascii="Poppins" w:hAnsi="Poppins" w:cs="Poppins"/>
+          <w:b/>
+          <w:bCs/>
+        </w:rPr>
+        <w:t>upload</w:t>
+      </w:r>
+      <w:proofErr w:type="gramEnd"/>
+      <w:r>
+        <w:rPr>
+          <w:rFonts w:ascii="Poppins" w:hAnsi="Poppins" w:cs="Poppins"/>
+          <w:b/>
+          <w:bCs/>
+        </w:rPr>
+        <w:t>_max_filesize</w:t>
+      </w:r>
+      <w:proofErr w:type="spellEnd"/>
+      <w:r>
+        <w:rPr>
+          <w:rFonts w:ascii="Poppins" w:hAnsi="Poppins" w:cs="Poppins"/>
+          <w:b/>
+          <w:bCs/>
+        </w:rPr>
+        <w:t xml:space="preserve"> = 10M</w:t>
       </w:r>
     </w:p>
     <w:p>
@@ -1514,13 +1634,23 @@
         </w:rPr>
         <w:t xml:space="preserve">Exemple pour </w:t>
       </w:r>
-      <w:r>
-        <w:rPr>
-          <w:rFonts w:ascii="Poppins" w:hAnsi="Poppins" w:cs="Poppins"/>
-          <w:b/>
-          <w:bCs/>
-        </w:rPr>
-        <w:t>post_max_size :</w:t>
+      <w:proofErr w:type="spellStart"/>
+      <w:r>
+        <w:rPr>
+          <w:rFonts w:ascii="Poppins" w:hAnsi="Poppins" w:cs="Poppins"/>
+          <w:b/>
+          <w:bCs/>
+        </w:rPr>
+        <w:t>post_max_size</w:t>
+      </w:r>
+      <w:proofErr w:type="spellEnd"/>
+      <w:r>
+        <w:rPr>
+          <w:rFonts w:ascii="Poppins" w:hAnsi="Poppins" w:cs="Poppins"/>
+          <w:b/>
+          <w:bCs/>
+        </w:rPr>
+        <w:t> :</w:t>
       </w:r>
     </w:p>
     <w:p>
@@ -1537,13 +1667,209 @@
           <w:bCs/>
         </w:rPr>
       </w:pPr>
-      <w:r>
-        <w:rPr>
-          <w:rFonts w:ascii="Poppins" w:hAnsi="Poppins" w:cs="Poppins"/>
-          <w:b/>
-          <w:bCs/>
-        </w:rPr>
-        <w:t>post_max_size = 20M</w:t>
+      <w:proofErr w:type="spellStart"/>
+      <w:proofErr w:type="gramStart"/>
+      <w:r>
+        <w:rPr>
+          <w:rFonts w:ascii="Poppins" w:hAnsi="Poppins" w:cs="Poppins"/>
+          <w:b/>
+          <w:bCs/>
+        </w:rPr>
+        <w:t>post</w:t>
+      </w:r>
+      <w:proofErr w:type="gramEnd"/>
+      <w:r>
+        <w:rPr>
+          <w:rFonts w:ascii="Poppins" w:hAnsi="Poppins" w:cs="Poppins"/>
+          <w:b/>
+          <w:bCs/>
+        </w:rPr>
+        <w:t>_max_size</w:t>
+      </w:r>
+      <w:proofErr w:type="spellEnd"/>
+      <w:r>
+        <w:rPr>
+          <w:rFonts w:ascii="Poppins" w:hAnsi="Poppins" w:cs="Poppins"/>
+          <w:b/>
+          <w:bCs/>
+        </w:rPr>
+        <w:t xml:space="preserve"> = 20M</w:t>
+      </w:r>
+    </w:p>
+    <w:p>
+      <w:pPr>
+        <w:jc w:val="both"/>
+        <w:rPr>
+          <w:rFonts w:ascii="Poppins" w:hAnsi="Poppins" w:cs="Poppins"/>
+          <w:b/>
+          <w:bCs/>
+        </w:rPr>
+      </w:pPr>
+      <w:r>
+        <w:rPr>
+          <w:rFonts w:ascii="Poppins" w:hAnsi="Poppins" w:cs="Poppins"/>
+          <w:b/>
+          <w:bCs/>
+        </w:rPr>
+        <w:t xml:space="preserve">Attention : </w:t>
+      </w:r>
+    </w:p>
+    <w:p>
+      <w:pPr>
+        <w:pStyle w:val="Paragraphedeliste"/>
+        <w:numPr>
+          <w:ilvl w:val="0"/>
+          <w:numId w:val="1"/>
+        </w:numPr>
+        <w:jc w:val="both"/>
+        <w:rPr>
+          <w:rFonts w:ascii="Poppins" w:hAnsi="Poppins" w:cs="Poppins"/>
+          <w:b/>
+          <w:bCs/>
+        </w:rPr>
+      </w:pPr>
+      <w:r>
+        <w:rPr>
+          <w:rFonts w:ascii="Poppins" w:hAnsi="Poppins" w:cs="Poppins"/>
+          <w:b/>
+          <w:bCs/>
+        </w:rPr>
+        <w:t>Sauvegarder le fichier avant de le fermer sinon les modifications ne sont pas sauvegardées (</w:t>
+      </w:r>
+      <w:r>
+        <w:rPr>
+          <w:rFonts w:ascii="Poppins" w:hAnsi="Poppins" w:cs="Poppins"/>
+          <w:b/>
+          <w:bCs/>
+        </w:rPr>
+        <w:t>CTRL +</w:t>
+      </w:r>
+      <w:r>
+        <w:rPr>
+          <w:rFonts w:ascii="Poppins" w:hAnsi="Poppins" w:cs="Poppins"/>
+          <w:b/>
+          <w:bCs/>
+        </w:rPr>
+        <w:t xml:space="preserve"> S pour sauvegarder)</w:t>
+      </w:r>
+    </w:p>
+    <w:p>
+      <w:pPr>
+        <w:pStyle w:val="Paragraphedeliste"/>
+        <w:numPr>
+          <w:ilvl w:val="0"/>
+          <w:numId w:val="1"/>
+        </w:numPr>
+        <w:jc w:val="both"/>
+        <w:rPr>
+          <w:rFonts w:ascii="Poppins" w:hAnsi="Poppins" w:cs="Poppins"/>
+          <w:b/>
+          <w:bCs/>
+        </w:rPr>
+      </w:pPr>
+      <w:r>
+        <w:rPr>
+          <w:rFonts w:ascii="Poppins" w:hAnsi="Poppins" w:cs="Poppins"/>
+          <w:b/>
+          <w:bCs/>
+        </w:rPr>
+        <w:t>Relancer WampServer</w:t>
+      </w:r>
+    </w:p>
+    <w:p>
+      <w:pPr>
+        <w:ind w:left="708"/>
+        <w:jc w:val="both"/>
+        <w:rPr>
+          <w:rFonts w:ascii="Poppins" w:hAnsi="Poppins" w:cs="Poppins"/>
+        </w:rPr>
+      </w:pPr>
+      <w:r>
+        <w:rPr>
+          <w:rFonts w:ascii="Poppins" w:hAnsi="Poppins" w:cs="Poppins"/>
+        </w:rPr>
+        <w:t>Pour redémarrer il faut faire faire un clic droit sur l’icône WampServer et cliquer sur « Redémarrer de zéro » comme ci-dessous :</w:t>
+      </w:r>
+    </w:p>
+    <w:p>
+      <w:pPr>
+        <w:ind w:left="708"/>
+        <w:jc w:val="both"/>
+        <w:rPr>
+          <w:rFonts w:ascii="Poppins" w:hAnsi="Poppins" w:cs="Poppins"/>
+        </w:rPr>
+      </w:pPr>
+      <w:r>
+        <w:rPr>
+          <w:rFonts w:ascii="Poppins" w:hAnsi="Poppins" w:cs="Poppins"/>
+          <w:noProof/>
+        </w:rPr>
+        <w:lastRenderedPageBreak/>
+        <w:drawing>
+          <wp:inline distT="0" distB="0" distL="0" distR="0" wp14:anchorId="015EA608" wp14:editId="27142506">
+            <wp:extent cx="2962275" cy="3200400"/>
+            <wp:effectExtent l="0" t="0" r="9525" b="0"/>
+            <wp:docPr id="2088868506" name="Image 1" descr="Une image contenant texte, capture d’écran, logiciel, Icône d’ordinateur&#10;&#10;Le contenu généré par l’IA peut être incorrect."/>
+            <wp:cNvGraphicFramePr>
+              <a:graphicFrameLocks xmlns:a="http://schemas.openxmlformats.org/drawingml/2006/main" noChangeAspect="1"/>
+            </wp:cNvGraphicFramePr>
+            <a:graphic xmlns:a="http://schemas.openxmlformats.org/drawingml/2006/main">
+              <a:graphicData uri="http://schemas.openxmlformats.org/drawingml/2006/picture">
+                <pic:pic xmlns:pic="http://schemas.openxmlformats.org/drawingml/2006/picture">
+                  <pic:nvPicPr>
+                    <pic:cNvPr id="2088868506" name="Image 1" descr="Une image contenant texte, capture d’écran, logiciel, Icône d’ordinateur&#10;&#10;Le contenu généré par l’IA peut être incorrect."/>
+                    <pic:cNvPicPr/>
+                  </pic:nvPicPr>
+                  <pic:blipFill>
+                    <a:blip r:embed="rId14"/>
+                    <a:stretch>
+                      <a:fillRect/>
+                    </a:stretch>
+                  </pic:blipFill>
+                  <pic:spPr>
+                    <a:xfrm>
+                      <a:off x="0" y="0"/>
+                      <a:ext cx="2962275" cy="3200400"/>
+                    </a:xfrm>
+                    <a:prstGeom prst="rect">
+                      <a:avLst/>
+                    </a:prstGeom>
+                  </pic:spPr>
+                </pic:pic>
+              </a:graphicData>
+            </a:graphic>
+          </wp:inline>
+        </w:drawing>
+      </w:r>
+    </w:p>
+    <w:p>
+      <w:pPr>
+        <w:ind w:left="708"/>
+        <w:jc w:val="both"/>
+        <w:rPr>
+          <w:rFonts w:ascii="Poppins" w:hAnsi="Poppins" w:cs="Poppins"/>
+        </w:rPr>
+      </w:pPr>
+      <w:r>
+        <w:rPr>
+          <w:rFonts w:ascii="Poppins" w:hAnsi="Poppins" w:cs="Poppins"/>
+        </w:rPr>
+        <w:t>DURANT CE LAPS DE TEMPS LOCALHOST EST INACESSIBLE.</w:t>
+      </w:r>
+    </w:p>
+    <w:p>
+      <w:pPr>
+        <w:ind w:left="708"/>
+        <w:jc w:val="both"/>
+        <w:rPr>
+          <w:rFonts w:ascii="Poppins" w:hAnsi="Poppins" w:cs="Poppins"/>
+        </w:rPr>
+      </w:pPr>
+      <w:r>
+        <w:rPr>
+          <w:rFonts w:ascii="Poppins" w:hAnsi="Poppins" w:cs="Poppins"/>
+        </w:rPr>
+        <w:t>Une fois WampServer complètement redémarrer, retourner sur votre page</w:t>
       </w:r>
     </w:p>
     <w:p>
@@ -1627,7 +1953,7 @@
         </w:trPr>
         <w:tc>
           <w:tcPr>
-            <w:tcW w:w="1050" w:type="dxa"/>
+            <w:tcW w:w="1049" w:type="dxa"/>
             <w:tcBorders>
               <w:top w:val="single" w:sz="6" w:space="0" w:color="auto"/>
               <w:left w:val="single" w:sz="6" w:space="0" w:color="auto"/>
@@ -1661,7 +1987,7 @@
         </w:tc>
         <w:tc>
           <w:tcPr>
-            <w:tcW w:w="1320" w:type="dxa"/>
+            <w:tcW w:w="1388" w:type="dxa"/>
             <w:tcBorders>
               <w:top w:val="single" w:sz="6" w:space="0" w:color="auto"/>
               <w:left w:val="single" w:sz="6" w:space="0" w:color="auto"/>
@@ -1695,7 +2021,7 @@
         </w:tc>
         <w:tc>
           <w:tcPr>
-            <w:tcW w:w="1575" w:type="dxa"/>
+            <w:tcW w:w="1569" w:type="dxa"/>
             <w:tcBorders>
               <w:top w:val="single" w:sz="6" w:space="0" w:color="auto"/>
               <w:left w:val="single" w:sz="6" w:space="0" w:color="auto"/>
@@ -1729,7 +2055,7 @@
         </w:tc>
         <w:tc>
           <w:tcPr>
-            <w:tcW w:w="1574" w:type="dxa"/>
+            <w:tcW w:w="1565" w:type="dxa"/>
             <w:tcBorders>
               <w:top w:val="single" w:sz="6" w:space="0" w:color="auto"/>
               <w:left w:val="single" w:sz="6" w:space="0" w:color="auto"/>
@@ -1763,7 +2089,7 @@
         </w:tc>
         <w:tc>
           <w:tcPr>
-            <w:tcW w:w="3537" w:type="dxa"/>
+            <w:tcW w:w="3485" w:type="dxa"/>
             <w:tcBorders>
               <w:top w:val="single" w:sz="6" w:space="0" w:color="auto"/>
               <w:left w:val="single" w:sz="6" w:space="0" w:color="auto"/>
@@ -1802,7 +2128,7 @@
         </w:trPr>
         <w:tc>
           <w:tcPr>
-            <w:tcW w:w="1050" w:type="dxa"/>
+            <w:tcW w:w="1049" w:type="dxa"/>
             <w:tcBorders>
               <w:top w:val="single" w:sz="6" w:space="0" w:color="auto"/>
               <w:left w:val="single" w:sz="6" w:space="0" w:color="auto"/>
@@ -1828,7 +2154,7 @@
         </w:tc>
         <w:tc>
           <w:tcPr>
-            <w:tcW w:w="1320" w:type="dxa"/>
+            <w:tcW w:w="1388" w:type="dxa"/>
             <w:tcBorders>
               <w:top w:val="single" w:sz="6" w:space="0" w:color="auto"/>
               <w:left w:val="single" w:sz="6" w:space="0" w:color="auto"/>
@@ -1854,7 +2180,7 @@
         </w:tc>
         <w:tc>
           <w:tcPr>
-            <w:tcW w:w="1575" w:type="dxa"/>
+            <w:tcW w:w="1569" w:type="dxa"/>
             <w:tcBorders>
               <w:top w:val="single" w:sz="6" w:space="0" w:color="auto"/>
               <w:left w:val="single" w:sz="6" w:space="0" w:color="auto"/>
@@ -1874,19 +2200,13 @@
               <w:rPr>
                 <w:rFonts w:ascii="Poppins" w:hAnsi="Poppins" w:cs="Poppins"/>
               </w:rPr>
-              <w:t>BARTHOUX-SAUZE T.</w:t>
-            </w:r>
-            <w:r>
-              <w:rPr>
-                <w:rFonts w:ascii="Poppins" w:hAnsi="Poppins" w:cs="Poppins"/>
-              </w:rPr>
-              <w:t> </w:t>
+              <w:t>BARTHOUX-SAUZE T. </w:t>
             </w:r>
           </w:p>
         </w:tc>
         <w:tc>
           <w:tcPr>
-            <w:tcW w:w="1574" w:type="dxa"/>
+            <w:tcW w:w="1565" w:type="dxa"/>
             <w:tcBorders>
               <w:top w:val="single" w:sz="6" w:space="0" w:color="auto"/>
               <w:left w:val="single" w:sz="6" w:space="0" w:color="auto"/>
@@ -1906,19 +2226,13 @@
               <w:rPr>
                 <w:rFonts w:ascii="Poppins" w:hAnsi="Poppins" w:cs="Poppins"/>
               </w:rPr>
-              <w:t> </w:t>
-            </w:r>
-            <w:r>
-              <w:rPr>
-                <w:rFonts w:ascii="Poppins" w:hAnsi="Poppins" w:cs="Poppins"/>
-              </w:rPr>
-              <w:t>GARNIER J.</w:t>
+              <w:t> GARNIER J.</w:t>
             </w:r>
           </w:p>
         </w:tc>
         <w:tc>
           <w:tcPr>
-            <w:tcW w:w="3537" w:type="dxa"/>
+            <w:tcW w:w="3485" w:type="dxa"/>
             <w:tcBorders>
               <w:top w:val="single" w:sz="6" w:space="0" w:color="auto"/>
               <w:left w:val="single" w:sz="6" w:space="0" w:color="auto"/>
@@ -1949,7 +2263,7 @@
         </w:trPr>
         <w:tc>
           <w:tcPr>
-            <w:tcW w:w="1050" w:type="dxa"/>
+            <w:tcW w:w="1049" w:type="dxa"/>
             <w:tcBorders>
               <w:top w:val="single" w:sz="6" w:space="0" w:color="auto"/>
               <w:left w:val="single" w:sz="6" w:space="0" w:color="auto"/>
@@ -1974,7 +2288,7 @@
         </w:tc>
         <w:tc>
           <w:tcPr>
-            <w:tcW w:w="1320" w:type="dxa"/>
+            <w:tcW w:w="1388" w:type="dxa"/>
             <w:tcBorders>
               <w:top w:val="single" w:sz="6" w:space="0" w:color="auto"/>
               <w:left w:val="single" w:sz="6" w:space="0" w:color="auto"/>
@@ -1999,7 +2313,7 @@
         </w:tc>
         <w:tc>
           <w:tcPr>
-            <w:tcW w:w="1575" w:type="dxa"/>
+            <w:tcW w:w="1569" w:type="dxa"/>
             <w:tcBorders>
               <w:top w:val="single" w:sz="6" w:space="0" w:color="auto"/>
               <w:left w:val="single" w:sz="6" w:space="0" w:color="auto"/>
@@ -2024,7 +2338,7 @@
         </w:tc>
         <w:tc>
           <w:tcPr>
-            <w:tcW w:w="1574" w:type="dxa"/>
+            <w:tcW w:w="1565" w:type="dxa"/>
             <w:tcBorders>
               <w:top w:val="single" w:sz="6" w:space="0" w:color="auto"/>
               <w:left w:val="single" w:sz="6" w:space="0" w:color="auto"/>
@@ -2043,7 +2357,7 @@
         </w:tc>
         <w:tc>
           <w:tcPr>
-            <w:tcW w:w="3537" w:type="dxa"/>
+            <w:tcW w:w="3485" w:type="dxa"/>
             <w:tcBorders>
               <w:top w:val="single" w:sz="6" w:space="0" w:color="auto"/>
               <w:left w:val="single" w:sz="6" w:space="0" w:color="auto"/>
@@ -2067,6 +2381,130 @@
           </w:p>
         </w:tc>
       </w:tr>
+      <w:tr>
+        <w:trPr>
+          <w:trHeight w:val="300"/>
+        </w:trPr>
+        <w:tc>
+          <w:tcPr>
+            <w:tcW w:w="1049" w:type="dxa"/>
+            <w:tcBorders>
+              <w:top w:val="single" w:sz="6" w:space="0" w:color="auto"/>
+              <w:left w:val="single" w:sz="6" w:space="0" w:color="auto"/>
+              <w:bottom w:val="single" w:sz="6" w:space="0" w:color="auto"/>
+              <w:right w:val="single" w:sz="6" w:space="0" w:color="auto"/>
+            </w:tcBorders>
+          </w:tcPr>
+          <w:p>
+            <w:pPr>
+              <w:jc w:val="both"/>
+              <w:rPr>
+                <w:rFonts w:ascii="Poppins" w:hAnsi="Poppins" w:cs="Poppins"/>
+              </w:rPr>
+            </w:pPr>
+            <w:r>
+              <w:rPr>
+                <w:rFonts w:ascii="Poppins" w:hAnsi="Poppins" w:cs="Poppins"/>
+              </w:rPr>
+              <w:t>V3</w:t>
+            </w:r>
+          </w:p>
+        </w:tc>
+        <w:tc>
+          <w:tcPr>
+            <w:tcW w:w="1388" w:type="dxa"/>
+            <w:tcBorders>
+              <w:top w:val="single" w:sz="6" w:space="0" w:color="auto"/>
+              <w:left w:val="single" w:sz="6" w:space="0" w:color="auto"/>
+              <w:bottom w:val="single" w:sz="6" w:space="0" w:color="auto"/>
+              <w:right w:val="single" w:sz="6" w:space="0" w:color="auto"/>
+            </w:tcBorders>
+          </w:tcPr>
+          <w:p>
+            <w:pPr>
+              <w:jc w:val="both"/>
+              <w:rPr>
+                <w:rFonts w:ascii="Poppins" w:hAnsi="Poppins" w:cs="Poppins"/>
+              </w:rPr>
+            </w:pPr>
+            <w:r>
+              <w:rPr>
+                <w:rFonts w:ascii="Poppins" w:hAnsi="Poppins" w:cs="Poppins"/>
+              </w:rPr>
+              <w:t>1/03/2026</w:t>
+            </w:r>
+          </w:p>
+        </w:tc>
+        <w:tc>
+          <w:tcPr>
+            <w:tcW w:w="1569" w:type="dxa"/>
+            <w:tcBorders>
+              <w:top w:val="single" w:sz="6" w:space="0" w:color="auto"/>
+              <w:left w:val="single" w:sz="6" w:space="0" w:color="auto"/>
+              <w:bottom w:val="single" w:sz="6" w:space="0" w:color="auto"/>
+              <w:right w:val="single" w:sz="6" w:space="0" w:color="auto"/>
+            </w:tcBorders>
+          </w:tcPr>
+          <w:p>
+            <w:pPr>
+              <w:jc w:val="both"/>
+              <w:rPr>
+                <w:rFonts w:ascii="Poppins" w:hAnsi="Poppins" w:cs="Poppins"/>
+              </w:rPr>
+            </w:pPr>
+            <w:r>
+              <w:rPr>
+                <w:rFonts w:ascii="Poppins" w:hAnsi="Poppins" w:cs="Poppins"/>
+              </w:rPr>
+              <w:t>GARNIER J.</w:t>
+            </w:r>
+          </w:p>
+        </w:tc>
+        <w:tc>
+          <w:tcPr>
+            <w:tcW w:w="1565" w:type="dxa"/>
+            <w:tcBorders>
+              <w:top w:val="single" w:sz="6" w:space="0" w:color="auto"/>
+              <w:left w:val="single" w:sz="6" w:space="0" w:color="auto"/>
+              <w:bottom w:val="single" w:sz="6" w:space="0" w:color="auto"/>
+              <w:right w:val="single" w:sz="6" w:space="0" w:color="auto"/>
+            </w:tcBorders>
+          </w:tcPr>
+          <w:p>
+            <w:pPr>
+              <w:jc w:val="both"/>
+              <w:rPr>
+                <w:rFonts w:ascii="Poppins" w:hAnsi="Poppins" w:cs="Poppins"/>
+              </w:rPr>
+            </w:pPr>
+          </w:p>
+        </w:tc>
+        <w:tc>
+          <w:tcPr>
+            <w:tcW w:w="3485" w:type="dxa"/>
+            <w:tcBorders>
+              <w:top w:val="single" w:sz="6" w:space="0" w:color="auto"/>
+              <w:left w:val="single" w:sz="6" w:space="0" w:color="auto"/>
+              <w:bottom w:val="single" w:sz="6" w:space="0" w:color="auto"/>
+              <w:right w:val="single" w:sz="6" w:space="0" w:color="auto"/>
+            </w:tcBorders>
+          </w:tcPr>
+          <w:p>
+            <w:pPr>
+              <w:jc w:val="both"/>
+              <w:rPr>
+                <w:rFonts w:ascii="Poppins" w:hAnsi="Poppins" w:cs="Poppins"/>
+              </w:rPr>
+            </w:pPr>
+            <w:r>
+              <w:rPr>
+                <w:rFonts w:ascii="Poppins" w:hAnsi="Poppins" w:cs="Poppins"/>
+              </w:rPr>
+              <w:t>Ajout de quelques détails supplémentaires</w:t>
+            </w:r>
+          </w:p>
+        </w:tc>
+      </w:tr>
     </w:tbl>
     <w:p>
       <w:pPr>
@@ -2077,8 +2515,8 @@
       </w:pPr>
     </w:p>
     <w:sectPr>
-      <w:headerReference w:type="default" r:id="rId14"/>
-      <w:footerReference w:type="default" r:id="rId15"/>
+      <w:headerReference w:type="default" r:id="rId15"/>
+      <w:footerReference w:type="default" r:id="rId16"/>
       <w:pgSz w:w="11906" w:h="16838"/>
       <w:pgMar w:top="1417" w:right="1417" w:bottom="1417" w:left="1417" w:header="708" w:footer="708" w:gutter="0"/>
       <w:cols w:space="708"/>
@@ -3209,6 +3647,7 @@
   <w:style w:type="character" w:default="1" w:styleId="Policepardfaut">
     <w:name w:val="Default Paragraph Font"/>
     <w:uiPriority w:val="1"/>
+    <w:semiHidden/>
     <w:unhideWhenUsed/>
   </w:style>
   <w:style w:type="table" w:default="1" w:styleId="TableauNormal">

</xml_diff>